<commit_message>
feat(talento-tecnico): actualizar a los 5 temas oficiales de capacitacion gerencial y eliminar completamente modulos de retorno de inversion del TSU
</commit_message>
<xml_diff>
--- a/Cursos/Talento_Tecnico/Dosificacion_y_Secuencia_Didactica_Talento_Tecnico_Kinal.docx
+++ b/Cursos/Talento_Tecnico/Dosificacion_y_Secuencia_Didactica_Talento_Tecnico_Kinal.docx
@@ -29,7 +29,7 @@
         </w:rPr>
         <w:t>DOSIFICACIÓN DIDÁCTICA Y SECUENCIACIÓN OPERATIVA:</w:t>
         <w:br/>
-        <w:t>PROGRAMA EJECUTIVO EN GESTIÓN DEL TALENTO TÉCNICO, LIDERAZGO Y FACTOR HUMANO</w:t>
+        <w:t>PROGRAMA EJECUTIVO DE VINCULACIÓN Y LIDERAZGO: GESTIÓN DEL TALENTO TÉCNICO Y MANDOS MEDIOS</w:t>
       </w:r>
     </w:p>
     <w:p>
@@ -94,7 +94,7 @@
                 <w:color w:val="2D3748"/>
                 <w:sz w:val="19"/>
               </w:rPr>
-              <w:t>«El aprender en el proceso del trabajo es base y a la vez objetivo de la acción formativa». Las 16 horas de contacto directo se estructuran a lo largo de un mes mediante 4 sesiones virtuales semanales de 2 horas en Microsoft Teams y 2 jornadas presenciales especiales de 4 horas en el campus de Fundación Kinal (Jornada Inicial de Apertura y Jornada de Cierre con Entrega de Diplomas y Reconocimientos). El programa genera un espacio de diálogo bidireccional industria-academia para identificar oportunidades de mejora y dotar a los líderes de equipos de herramientas prácticas en manejo de personal, liderazgo humanista y desarrollo de mandos medios. Umbral aprobatorio institucional: 75 puntos sobre 100.</w:t>
+              <w:t>«El aprender en el proceso del trabajo es base y a la vez objetivo de la acción formativa». Las 16 horas de contacto directo sincrónico y presencial se estructuran a lo largo de un mes mediante 4 sesiones virtuales semanales de 2 horas en Microsoft Teams y 2 jornadas presenciales especiales de 4 horas en el campus de Fundación Kinal (Jornada Inicial de Apertura y Jornada de Cierre con Entrega de Diplomas y Reconocimientos). El programa genera un espacio formal de diálogo bidireccional industria-academia para identificar necesidades reales y dotar a los líderes de herramientas gerenciales en manejo de personal, liderazgo humanista, competencias operativas y desarrollo de mandos medios. Umbral aprobatorio institucional: 75 puntos sobre 100.</w:t>
             </w:r>
           </w:p>
         </w:tc>
@@ -272,7 +272,7 @@
                 <w:color w:val="1A202C"/>
                 <w:sz w:val="16"/>
               </w:rPr>
-              <w:t>Apertura e Inmersión Kinal</w:t>
+              <w:t>Apertura y Diálogo Inicial</w:t>
             </w:r>
           </w:p>
         </w:tc>
@@ -298,7 +298,7 @@
                 <w:color w:val="1A202C"/>
                 <w:sz w:val="16"/>
               </w:rPr>
-              <w:t>Apertura institucional, presentación de la iniciativa, networking y recorrido por laboratorios TSU</w:t>
+              <w:t>Apertura institucional, presentación de la iniciativa, networking y Mesa de Diálogo 1: Necesidades de la industria y expectativas</w:t>
             </w:r>
           </w:p>
         </w:tc>
@@ -324,7 +324,7 @@
                 <w:color w:val="1A202C"/>
                 <w:sz w:val="16"/>
               </w:rPr>
-              <w:t>Ficha diagnóstica inicial de expectativas y necesidades</w:t>
+              <w:t>Ficha diagnóstica preliminar de necesidades y registro</w:t>
             </w:r>
           </w:p>
         </w:tc>
@@ -375,7 +375,7 @@
                 <w:color w:val="1A202C"/>
                 <w:sz w:val="16"/>
               </w:rPr>
-              <w:t>Manejo de Personal</w:t>
+              <w:t>Manejo y Desarrollo de Personal</w:t>
             </w:r>
           </w:p>
         </w:tc>
@@ -399,7 +399,7 @@
                 <w:color w:val="1A202C"/>
                 <w:sz w:val="16"/>
               </w:rPr>
-              <w:t>Atracción, reclutamiento técnico, inducción acelerada y reducción de costos por rotación ('Missing Middle')</w:t>
+              <w:t>Atracción por competencias, onboarding técnico acelerado (30-60-90 días), curvas de aprendizaje y reducción de rotación</w:t>
             </w:r>
           </w:p>
         </w:tc>
@@ -424,7 +424,7 @@
                 <w:color w:val="1A202C"/>
                 <w:sz w:val="16"/>
               </w:rPr>
-              <w:t>Descriptor de puesto técnico por competencias demostrables</w:t>
+              <w:t>Descriptor de puesto técnico por competencias y plan de inducción</w:t>
             </w:r>
           </w:p>
         </w:tc>
@@ -502,7 +502,7 @@
                 <w:color w:val="1A202C"/>
                 <w:sz w:val="16"/>
               </w:rPr>
-              <w:t>Antropología de Kinal, los 4 pilares operativos, erradicación del maltrato en planta y seguridad psicológica</w:t>
+              <w:t>Antropología de Kinal, los 4 pilares operativos, erradicación del maltrato en planta y fomento de seguridad psicológica</w:t>
             </w:r>
           </w:p>
         </w:tc>
@@ -579,7 +579,7 @@
                 <w:color w:val="1A202C"/>
                 <w:sz w:val="16"/>
               </w:rPr>
-              <w:t>Competencias y Formación Dual</w:t>
+              <w:t>Fortalecimiento de Competencias</w:t>
             </w:r>
           </w:p>
         </w:tc>
@@ -603,7 +603,7 @@
                 <w:color w:val="1A202C"/>
                 <w:sz w:val="16"/>
               </w:rPr>
-              <w:t>Marco DQR 5-6, retorno de inversión (ROI) del TSU y esquemas de co-formación dual escuela-empresa</w:t>
+              <w:t>Mapeo de matrices de competencias operativas (saber, hacer, ser), evaluación práctica en puesto y aprendizaje continuo</w:t>
             </w:r>
           </w:p>
         </w:tc>
@@ -628,7 +628,7 @@
                 <w:color w:val="1A202C"/>
                 <w:sz w:val="16"/>
               </w:rPr>
-              <w:t>Propuesta de semillero técnico dual y perfil de tutor Ausbilder</w:t>
+              <w:t>Matriz de competencias técnicas operativas de planta</w:t>
             </w:r>
           </w:p>
         </w:tc>
@@ -681,7 +681,7 @@
                 <w:color w:val="1A202C"/>
                 <w:sz w:val="16"/>
               </w:rPr>
-              <w:t>Mandos Medios y Demanda Industrial</w:t>
+              <w:t>Desarrollo de Mandos Medios</w:t>
             </w:r>
           </w:p>
         </w:tc>
@@ -706,7 +706,7 @@
                 <w:color w:val="1A202C"/>
                 <w:sz w:val="16"/>
               </w:rPr>
-              <w:t>Desarrollo del supervisor de primera línea, medición de KPIs (OEE, SSO) y demandas de Industria 4.0</w:t>
+              <w:t>Herramientas para supervisores de primera línea, retroalimentación asertiva, micro-charlas de valores y KPIs (OEE/SSO)</w:t>
             </w:r>
           </w:p>
         </w:tc>
@@ -732,7 +732,7 @@
                 <w:color w:val="1A202C"/>
                 <w:sz w:val="16"/>
               </w:rPr>
-              <w:t>Catálogo de 5 micro-charlas de valores y borrador de diagnóstico</w:t>
+              <w:t>Catálogo de 5 micro-charlas de Factor Humano y ficha diagnóstica</w:t>
             </w:r>
           </w:p>
         </w:tc>
@@ -786,7 +786,7 @@
                 <w:color w:val="1A202C"/>
                 <w:sz w:val="16"/>
               </w:rPr>
-              <w:t>Diálogo Industria y Clausura</w:t>
+              <w:t>Plenaria y Clausura</w:t>
             </w:r>
           </w:p>
         </w:tc>
@@ -812,7 +812,7 @@
                 <w:color w:val="1A202C"/>
                 <w:sz w:val="16"/>
               </w:rPr>
-              <w:t>Plenaria de diálogo Kinal-Empresas, consolidación de necesidades técnicas y humanas, entrega de diplomas y reconocimientos</w:t>
+              <w:t>Mesa Redonda Plenaria: Sistematización de necesidades de la industria, entrega solemne de diplomas y reconocimientos a empresas</w:t>
             </w:r>
           </w:p>
         </w:tc>
@@ -889,7 +889,7 @@
           <w:color w:val="003366"/>
           <w:sz w:val="23"/>
         </w:rPr>
-        <w:t>Jornada Presencial Especial 1 (Campus Kinal) — Inauguración de la Iniciativa de Vinculación, Networking Directivo y Recorrido por Talleres TSU</w:t>
+        <w:t>Jornada Presencial Especial 1 (Campus Kinal) — Apertura Institucional, Presentación de la Iniciativa y Mesa de Diálogo 1: Necesidades de la Industria</w:t>
       </w:r>
     </w:p>
     <w:tbl>
@@ -959,7 +959,7 @@
                 <w:color w:val="1A202C"/>
                 <w:sz w:val="17"/>
               </w:rPr>
-              <w:t>Apertura Institucional e Inmersión Técnica  |  4 Horas (240 min)</w:t>
+              <w:t>Apertura y Diálogo sobre Necesidades Industriales  |  4 Horas (240 min)</w:t>
             </w:r>
           </w:p>
         </w:tc>
@@ -1011,7 +1011,7 @@
                 <w:color w:val="1A202C"/>
                 <w:sz w:val="17"/>
               </w:rPr>
-              <w:t>Conoce en profundidad la propuesta formativa integral de Kinal, establece vínculos de diálogo directivo y comprueba in situ la capacidad de los laboratorios de educación técnica superior.</w:t>
+              <w:t>Conoce la visión formativa integral de Kinal, establece redes de contacto directivo y participa en el diagnóstico inicial sobre las necesidades de cualificación técnica en las empresas.</w:t>
             </w:r>
           </w:p>
         </w:tc>
@@ -1063,7 +1063,7 @@
                 <w:color w:val="1A202C"/>
                 <w:sz w:val="17"/>
               </w:rPr>
-              <w:t>Apertura (30 min): Recepción protocolaria de los representantes empresariales en el Auditorio Ejecutivo de Fundación Kinal. Palabras de bienvenida a cargo de la Dirección de Vinculación y Dirección General. Encuadre del propósito del programa y dinámica de presentación de empresas participantes.</w:t>
+              <w:t>Apertura (30 min): Recepción protocolaria de los representantes empresariales en el Auditorio Ejecutivo de Fundación Kinal. Palabras de bienvenida a cargo de la Dirección de Vinculación y Dirección General. Encuadre de los objetivos del programa y dinámica de presentación de empresas participantes.</w:t>
             </w:r>
           </w:p>
         </w:tc>
@@ -1115,7 +1115,7 @@
                 <w:color w:val="1A202C"/>
                 <w:sz w:val="17"/>
               </w:rPr>
-              <w:t>Desarrollo (180 min con pausa activa de 20 min): Recorrido inmersivo guiado por los complejos de formación técnica: Laboratorios de Automatización Industrial y PLCs Siemens, Robótica, Mecatrónica CNC, Redes y Telecomunicaciones, Electrónica y Talleres de Mecánica. Estudiantes de último año de TSU realizan demostraciones operativas en vivo. Mesa de trabajo preliminar: diálogo abierto sobre la disponibilidad de personal técnico calificado y los desafíos del 'Missing Middle' en las empresas.</w:t>
+              <w:t>Desarrollo (180 min con pausa activa de 20 min): Recorrido guiado por los talleres y laboratorios técnicos de Kinal (automatización, robótica, mecatrónica, electrónica y redes). Observación de metodologías de aprendizaje práctico. Mesa de Diálogo 1: conversatorio abierto entre gerentes y autoridades de Kinal sobre los principales retos en la gestión de personal operativo y las brechas de competencias más críticas en la industria.</w:t>
             </w:r>
           </w:p>
         </w:tc>
@@ -1167,7 +1167,7 @@
                 <w:color w:val="1A202C"/>
                 <w:sz w:val="17"/>
               </w:rPr>
-              <w:t>Cierre (30 min): Plenaria de síntesis de la jornada, instrucciones para el acceso al aula virtual en Kinal.academy y la plataforma Microsoft Teams, y brindis de café de bienvenida.</w:t>
+              <w:t>Cierre (30 min): Plenaria de síntesis de la jornada, entrega de la Ficha Diagnóstica de Necesidades Industriales, encuadre para las sesiones en Microsoft Teams y Kinal.academy, y café de networking.</w:t>
             </w:r>
           </w:p>
         </w:tc>
@@ -1219,7 +1219,7 @@
                 <w:color w:val="1A202C"/>
                 <w:sz w:val="17"/>
               </w:rPr>
-              <w:t>Campus Fundación Kinal (Auditorio Ejecutivo y Complejo de Laboratorios TSU), guías impresas, estación de café.</w:t>
+              <w:t>Campus Fundación Kinal (Auditorio Ejecutivo y Complejo de Laboratorios Técnicos), guías impresas, estación de café.</w:t>
             </w:r>
           </w:p>
         </w:tc>
@@ -1272,7 +1272,7 @@
                 <w:color w:val="1A202C"/>
                 <w:sz w:val="17"/>
               </w:rPr>
-              <w:t>Ficha diagnóstica preliminar de expectativas empresariales y registro formal de participación.</w:t>
+              <w:t>Ficha diagnóstica preliminar de necesidades y registro formal de participación.</w:t>
             </w:r>
           </w:p>
         </w:tc>
@@ -1295,7 +1295,7 @@
           <w:color w:val="003366"/>
           <w:sz w:val="23"/>
         </w:rPr>
-        <w:t>Sesión Virtual 1 (Semana 1 — Microsoft Teams) — Atracción, Inducción Técnica Acelerada y Retención de Talento Operativo</w:t>
+        <w:t>Sesión Virtual 1 (Semana 1 — Microsoft Teams) — Atracción por Competencias, Inducción Técnica Acelerada (Onboarding) y Reducción de Rotación</w:t>
       </w:r>
     </w:p>
     <w:tbl>
@@ -1417,7 +1417,7 @@
                 <w:color w:val="1A202C"/>
                 <w:sz w:val="17"/>
               </w:rPr>
-              <w:t>Aplica técnicas contemporáneas para el reclutamiento por competencias y la estructuración de procesos de inducción que mitiguen la rotación prematura en planta.</w:t>
+              <w:t>Aplica técnicas contemporáneas para el reclutamiento operativo basado en competencias y estructura planes de inducción técnica acelerada que mitiguen la rotación temprana.</w:t>
             </w:r>
           </w:p>
         </w:tc>
@@ -1469,7 +1469,7 @@
                 <w:color w:val="1A202C"/>
                 <w:sz w:val="17"/>
               </w:rPr>
-              <w:t>Apertura (15 min): Bienvenida en Teams y pregunta detonante: '¿Cuánto le cuesta realmente a su organización la rotación de un técnico en los primeros 90 días?'. Discusión en el chat interactivo.</w:t>
+              <w:t>Apertura (15 min): Bienvenida en Teams y pregunta detonante: '¿Cuánto le cuesta realmente a su organización la rotación de un colaborador técnico en los primeros 90 días?'. Discusión en el chat interactivo.</w:t>
             </w:r>
           </w:p>
         </w:tc>
@@ -1521,7 +1521,7 @@
                 <w:color w:val="1A202C"/>
                 <w:sz w:val="17"/>
               </w:rPr>
-              <w:t>Desarrollo (90 min con pausa de 10 min): Exposición interactiva: por qué fracasan los perfiles de puesto tradicionales en el ámbito operativo. Metodología de descriptores por competencias demostrables (saber, saber hacer y saber ser). Estructuración de la curva de aprendizaje en 30-60-90 días. Trabajo en salas privadas de Teams: rediseño de un perfil técnico crítico para la empresa.</w:t>
+              <w:t>Desarrollo (90 min con pausa de 10 min): Por qué fracasan los descriptores de puesto tradicionales en piso operativo. Diseño de matrices de competencias demostrables (saber, saber hacer y saber ser). Estructuración de la curva de aprendizaje en 30-60-90 días. Taller en salas de Teams: rediseño de un puesto técnico crítico para la empresa del participante.</w:t>
             </w:r>
           </w:p>
         </w:tc>
@@ -1573,7 +1573,7 @@
                 <w:color w:val="1A202C"/>
                 <w:sz w:val="17"/>
               </w:rPr>
-              <w:t>Cierre (15 min): Socialización de perfiles mejorados, conclusiones ejecutivas y asignación de la lectura sobre Factor Humano en Kinal.academy.</w:t>
+              <w:t>Cierre (15 min): Socialización de matrices mejoradas, conclusiones ejecutivas y asignación de la lectura sobre Factor Humano en Kinal.academy.</w:t>
             </w:r>
           </w:p>
         </w:tc>
@@ -1823,7 +1823,7 @@
                 <w:color w:val="1A202C"/>
                 <w:sz w:val="17"/>
               </w:rPr>
-              <w:t>Formula políticas y protocolos de liderazgo humanista para erradicar el maltrato en cuadrillas de taller y promover la excelencia y seguridad psicológica.</w:t>
+              <w:t>Formula políticas y protocolos de liderazgo humanista para erradicar el maltrato en cuadrillas de taller y promover la excelencia y seguridad psicológica en las operaciones.</w:t>
             </w:r>
           </w:p>
         </w:tc>
@@ -1875,7 +1875,7 @@
                 <w:color w:val="1A202C"/>
                 <w:sz w:val="17"/>
               </w:rPr>
-              <w:t>Apertura (15 min): Presentación del video testimonial: 'El sello del técnico de Kinal en la industria'. Reflexión sobre el trabajo como ámbito de dignidad y servicio.</w:t>
+              <w:t>Apertura (15 min): Presentación del video testimonial: 'El valor de la persona en el trabajo técnico'. Reflexión sobre el trabajo como ámbito de dignidad y servicio.</w:t>
             </w:r>
           </w:p>
         </w:tc>
@@ -2107,7 +2107,7 @@
           <w:color w:val="003366"/>
           <w:sz w:val="23"/>
         </w:rPr>
-        <w:t>Sesión Virtual 3 (Semana 3 — Microsoft Teams) — Estándares Internacionales (DQR 5-6), el Valor del TSU y Semilleros de Formación Dual</w:t>
+        <w:t>Sesión Virtual 3 (Semana 3 — Microsoft Teams) — Mapeo de Matrices de Competencias Operativas, Evaluación Práctica y Aprendizaje Continuo</w:t>
       </w:r>
     </w:p>
     <w:tbl>
@@ -2177,7 +2177,7 @@
                 <w:color w:val="1A202C"/>
                 <w:sz w:val="17"/>
               </w:rPr>
-              <w:t>Fortalecimiento de Competencias Técnicas y Formación Dual  |  2 Horas (120 min)</w:t>
+              <w:t>Fortalecimiento de Competencias Técnicas  |  2 Horas (120 min)</w:t>
             </w:r>
           </w:p>
         </w:tc>
@@ -2229,7 +2229,7 @@
                 <w:color w:val="1A202C"/>
                 <w:sz w:val="17"/>
               </w:rPr>
-              <w:t>Comprende la correspondencia de cualificaciones del Técnico Superior Universitario y diseña esquemas de semilleros duales con tutores de empresa (Ausbilder).</w:t>
+              <w:t>Diseña instrumentos objetivos para mapear y evaluar competencias técnicas operativas en el puesto de trabajo y estructura esquemas de aprendizaje continuo en la empresa.</w:t>
             </w:r>
           </w:p>
         </w:tc>
@@ -2281,7 +2281,7 @@
                 <w:color w:val="1A202C"/>
                 <w:sz w:val="17"/>
               </w:rPr>
-              <w:t>Apertura (15 min): Sondeo interactivo: '¿Ha experimentado la frustración de contratar a un ingeniero para operar una máquina y que renuncie a los 6 meses?'. Debate inicial.</w:t>
+              <w:t>Apertura (15 min): Sondeo interactivo: '¿Cómo evalúa hoy en día si un operario realmente domina la calibración o diagnóstico de una máquina antes de asignarle la línea?'. Debate inicial.</w:t>
             </w:r>
           </w:p>
         </w:tc>
@@ -2333,7 +2333,7 @@
                 <w:color w:val="1A202C"/>
                 <w:sz w:val="17"/>
               </w:rPr>
-              <w:t>Desarrollo (90 min con pausa de 10 min): Marco Alemán de Cualificaciones (DQR Niveles 5 y 6 / Meister). Comparativa de perfiles: Ingeniero (diseño y estrategia) vs TSU (supervisión, programación de PLCs y resolución de averías en campo) vs Operario empírico. Modelado del Retorno de Inversión (ROI): ahorro por reducción de MTTR y merma. Fundamentos del Sistema Dual en alternancia y el rol del tutor en planta (*Ausbilder*).</w:t>
+              <w:t>Desarrollo (90 min con pausa de 10 min): Mapeo de matrices de competencias operativas bajo estándares internacionales. Diseño de pruebas de evaluación práctica en banco de trabajo (lectura de diagramas, uso de instrumentos y diagnóstico lógico de fallas). Esquemas de aprendizaje continuo en planta y el rol del mentor técnico (*Ausbilder*) para la transferencia de habilidades en el puesto.</w:t>
             </w:r>
           </w:p>
         </w:tc>
@@ -2385,7 +2385,7 @@
                 <w:color w:val="1A202C"/>
                 <w:sz w:val="17"/>
               </w:rPr>
-              <w:t>Cierre (15 min): Pautas para la articulación de convenios de semilleros de aprendizaje con Fundación Kinal y consignas de trabajo.</w:t>
+              <w:t>Cierre (15 min): Pautas para la aplicación del instrumento de evaluación técnica en sus plantas y consignas de trabajo.</w:t>
             </w:r>
           </w:p>
         </w:tc>
@@ -2437,7 +2437,7 @@
                 <w:color w:val="1A202C"/>
                 <w:sz w:val="17"/>
               </w:rPr>
-              <w:t>Microsoft Teams, calculadora de ROI en Excel, matriz comparativa DQR, Kinal.academy.</w:t>
+              <w:t>Microsoft Teams, matriz de competencias en Excel, guía de pruebas prácticas, Kinal.academy.</w:t>
             </w:r>
           </w:p>
         </w:tc>
@@ -2490,7 +2490,7 @@
                 <w:color w:val="1A202C"/>
                 <w:sz w:val="17"/>
               </w:rPr>
-              <w:t>Propuesta conceptual de semillero técnico dual y perfil del tutor empresarial de planta.</w:t>
+              <w:t>Matriz de competencias técnicas operativas y esquema de capacitación en puesto de trabajo.</w:t>
             </w:r>
           </w:p>
         </w:tc>
@@ -2513,7 +2513,7 @@
           <w:color w:val="003366"/>
           <w:sz w:val="23"/>
         </w:rPr>
-        <w:t>Sesión Virtual 4 (Semana 4 — Microsoft Teams) — Herramientas para Supervisores de Primera Línea, KPIs Operativos y Demandas de la Industria</w:t>
+        <w:t>Sesión Virtual 4 (Semana 4 — Microsoft Teams) — Herramientas para Supervisores de Primera Línea, Feedback Asertivo y Micro-Charlas de Valores</w:t>
       </w:r>
     </w:p>
     <w:tbl>
@@ -2583,7 +2583,7 @@
                 <w:color w:val="1A202C"/>
                 <w:sz w:val="17"/>
               </w:rPr>
-              <w:t>Desarrollo de Mandos Medios y Necesidades Actuales  |  2 Horas (120 min)</w:t>
+              <w:t>Desarrollo de Mandos Medios  |  2 Horas (120 min)</w:t>
             </w:r>
           </w:p>
         </w:tc>
@@ -2635,7 +2635,7 @@
                 <w:color w:val="1A202C"/>
                 <w:sz w:val="17"/>
               </w:rPr>
-              <w:t>Estructura un plan de fortalecimiento para mandos medios que vincule el factor humano con indicadores de productividad (OEE) y consolida la ficha de diagnóstico empresarial.</w:t>
+              <w:t>Estructura un plan de fortalecimiento para mandos medios que vincule el liderazgo con indicadores operativos (OEE, SSO) y consolida la Ficha Diagnóstica de Necesidades Industriales.</w:t>
             </w:r>
           </w:p>
         </w:tc>
@@ -2687,7 +2687,7 @@
                 <w:color w:val="1A202C"/>
                 <w:sz w:val="17"/>
               </w:rPr>
-              <w:t>Apertura (15 min): Encuadre: el supervisor de taller como articulador clave entre la estrategia gerencial y el piso operativo.</w:t>
+              <w:t>Apertura (15 min): Encuadre: el supervisor de taller como puente crítico entre la dirección estratégica y el piso operativo.</w:t>
             </w:r>
           </w:p>
         </w:tc>
@@ -2739,7 +2739,7 @@
                 <w:color w:val="1A202C"/>
                 <w:sz w:val="17"/>
               </w:rPr>
-              <w:t>Desarrollo (90 min con pausa de 10 min): Habilidades formativas para mandos medios: comunicación asertiva, retroalimentación correctiva sin humillar y manejo de conflictos en equipo. Diseño de 'Las Charlas de 10 Minutos de Factor Humano' antes de arrancar el turno. Nuevas tendencias tecnológicas (Industria 4.0, IoT y automatización) y su impacto en las destrezas requeridas. Revisión de la Ficha Diagnóstica de Necesidades de la Industria.</w:t>
+              <w:t>Desarrollo (90 min con pausa de 10 min): Habilidades formativas para mandos medios: comunicación asertiva, retroalimentación correctiva sin humillar y manejo constructivo de conflictos en cuadrillas. Diseño y ejecución de 'Las Charlas de 10 Minutos de Factor Humano' antes de iniciar el turno. Correlación entre factor humano y KPIs de negocio (OEE, tasa de accidentes SSO y merma). Revisión final de la Ficha Diagnóstica de Necesidades Industriales.</w:t>
             </w:r>
           </w:p>
         </w:tc>
@@ -2896,7 +2896,7 @@
                 <w:color w:val="1A202C"/>
                 <w:sz w:val="17"/>
               </w:rPr>
-              <w:t>Ficha de Diagnóstico de Necesidades Industriales completada y catálogo de 5 micro-charlas de Factor Humano.</w:t>
+              <w:t>Catálogo de 5 micro-charlas de Factor Humano y Ficha Diagnóstica de Necesidades Industriales completada.</w:t>
             </w:r>
           </w:p>
         </w:tc>
@@ -2919,7 +2919,7 @@
           <w:color w:val="003366"/>
           <w:sz w:val="23"/>
         </w:rPr>
-        <w:t>Jornada Presencial Especial 2 (Campus Kinal) — Mesa Redonda Plenaria Kinal-Empresas, Entrega de Diplomas y Reconocimientos Institucionales</w:t>
+        <w:t>Jornada Presencial Especial 2 (Campus Kinal) — Mesa Redonda Plenaria: Sistematización de Necesidades Industriales, Diplomas y Reconocimientos</w:t>
       </w:r>
     </w:p>
     <w:tbl>
@@ -2989,7 +2989,7 @@
                 <w:color w:val="1A202C"/>
                 <w:sz w:val="17"/>
               </w:rPr>
-              <w:t>Diálogo Industria-Academia, Reconocimientos y Clausura  |  4 Horas (240 min)</w:t>
+              <w:t>Plenaria Industria-Academia y Clausura  |  4 Horas (240 min)</w:t>
             </w:r>
           </w:p>
         </w:tc>
@@ -3145,7 +3145,7 @@
                 <w:color w:val="1A202C"/>
                 <w:sz w:val="17"/>
               </w:rPr>
-              <w:t>Desarrollo (190 min con pausa de 20 min): Mesa Redonda Plenaria: 'Construyendo el futuro de la educación técnica en Guatemala'. Presentación de los hallazgos consolidados de las fichas diagnósticas: qué competencias técnicas y humanas demanda prioritariamente el sector industrial. Diálogo abierto con las autoridades de Kinal para la retroalimentación de planes de estudio y actualización de carreras. Firma de compromisos y convenios marco de vinculación (bolsa de empleo y semilleros duales).</w:t>
+              <w:t>Desarrollo (190 min con pausa de 20 min): Mesa Redonda Plenaria: 'Construyendo el futuro de la educación técnica en Guatemala'. Presentación de los hallazgos consolidados de las fichas diagnósticas: qué competencias técnicas y humanas demanda prioritariamente el sector industrial. Diálogo abierto con las autoridades de Kinal para la retroalimentación de planes de estudio y actualización de carreras. Firma de compromisos y convenios marco de vinculación (bolsa de empleo y semilleros formativos).</w:t>
             </w:r>
           </w:p>
         </w:tc>
@@ -3197,7 +3197,7 @@
                 <w:color w:val="1A202C"/>
                 <w:sz w:val="17"/>
               </w:rPr>
-              <w:t>Cierre (30 min): Acto solemne de clausura: Entrega de Diplomas de Participación a los representantes empresariales y entrega de Reconocimientos Empresariales Especiales a las empresas aliadas. Brindis de honor y networking directivo.</w:t>
+              <w:t>Cierre (30 min): Acto solemne de clausura: Entrega de Diplomas de Participación Individual a los representantes empresariales y entrega de Reconocimientos Empresariales Especiales a las empresas aliadas. Brindis de honor y networking directivo.</w:t>
             </w:r>
           </w:p>
         </w:tc>
@@ -3381,7 +3381,7 @@
                 <w:color w:val="2D3748"/>
                 <w:sz w:val="19"/>
               </w:rPr>
-              <w:t>Para recibir el Diploma de Participación Individual y el Reconocimiento Empresarial Institucional de Fundación Kinal, el representante debe cumplir con un mínimo del 80% de asistencia sincrónica y alcanzar una calificación mínima de 75 puntos sobre 100 en la entrega de sus productos aplicativos y participación en el diálogo de vinculación.</w:t>
+              <w:t>Para recibir el Diploma de Participación Individual y el Reconocimiento Empresarial Institucional de Fundación Kinal, el representante debe cumplir con un mínimo del 80% de asistencia sincrónica y alcanzar una calificación mínima de 75 puntos sobre 100 en la entrega de sus productos aplicativos y participación en las mesas de diálogo.</w:t>
             </w:r>
           </w:p>
         </w:tc>
@@ -3533,7 +3533,7 @@
                 <w:color w:val="1A202C"/>
                 <w:sz w:val="16"/>
               </w:rPr>
-              <w:t>Participación en Sesiones y Aporte al Diálogo</w:t>
+              <w:t>Participación en Sesiones y Mesas de Diálogo</w:t>
             </w:r>
           </w:p>
         </w:tc>
@@ -3584,7 +3584,7 @@
                 <w:color w:val="1A202C"/>
                 <w:sz w:val="16"/>
               </w:rPr>
-              <w:t>Participa activamente en las 2 jornadas presenciales y sesiones en Teams, compartiendo la realidad operativa y desafíos de su organización.</w:t>
+              <w:t>Participa activamente en las 2 jornadas presenciales y sesiones en Teams, aportando datos de la realidad operativa y participando en el diálogo.</w:t>
             </w:r>
           </w:p>
         </w:tc>
@@ -3737,7 +3737,7 @@
                 <w:color w:val="1A202C"/>
                 <w:sz w:val="16"/>
               </w:rPr>
-              <w:t>Protocolo de Factor Humano y Charlas Operativas</w:t>
+              <w:t>Protocolo de Factor Humano y Micro-Charlas</w:t>
             </w:r>
           </w:p>
         </w:tc>
@@ -3840,7 +3840,7 @@
                 <w:color w:val="1A202C"/>
                 <w:sz w:val="16"/>
               </w:rPr>
-              <w:t>Ficha de Diagnóstico de Necesidades Industriales</w:t>
+              <w:t>Ficha Diagnóstica de Necesidades Industriales</w:t>
             </w:r>
           </w:p>
         </w:tc>
@@ -4030,7 +4030,7 @@
                 <w:color w:val="003366"/>
                 <w:sz w:val="18"/>
               </w:rPr>
-              <w:t>Competencias Técnicas más Escasas:</w:t>
+              <w:t>Competencias Técnicas más Demandadas:</w:t>
             </w:r>
           </w:p>
         </w:tc>
@@ -4054,7 +4054,7 @@
                 <w:color w:val="1A202C"/>
                 <w:sz w:val="18"/>
               </w:rPr>
-              <w:t>Principales dificultades técnicas observadas al contratar personal operativo (PLCs, calibración, mecánica, redes, etc.): __________________________________________________________________</w:t>
+              <w:t>Principales destrezas y conocimientos técnicos más difíciles de encontrar en el personal operativo: __________________________________________________________________</w:t>
             </w:r>
           </w:p>
         </w:tc>
@@ -4106,7 +4106,7 @@
                 <w:color w:val="1A202C"/>
                 <w:sz w:val="18"/>
               </w:rPr>
-              <w:t>Habilidades humanas y de liderazgo más necesarias en supervisores de planta (comunicación, respeto, trabajo bien hecho, etc.): _______________________________________________</w:t>
+              <w:t>Habilidades de liderazgo y humanas más necesarias en supervisores de planta (comunicación, respeto, trabajo bien hecho, etc.): _______________________________________________</w:t>
             </w:r>
           </w:p>
         </w:tc>
@@ -4158,7 +4158,7 @@
                 <w:color w:val="1A202C"/>
                 <w:sz w:val="18"/>
               </w:rPr>
-              <w:t>Nuevas maquinarias, protocolos o tecnologías a incorporar en los próximos 1-3 años (Industria 4.0, IoT, robótica, etc.): _____________________________________________________</w:t>
+              <w:t>Nuevas maquinarias, protocolos o tecnologías a incorporar en los próximos 1-3 años (automatización, IoT, robótica, redes, etc.): _______________________________________________</w:t>
             </w:r>
           </w:p>
         </w:tc>
@@ -4210,7 +4210,7 @@
                 <w:color w:val="1A202C"/>
                 <w:sz w:val="18"/>
               </w:rPr>
-              <w:t>[  ] Semilleros de Formación Dual    [  ] Pasantías TSU    [  ] Bolsa de Empleo Kinal    [  ] Capacitación a la medida</w:t>
+              <w:t>[  ] Bolsa de Empleo Kinal    [  ] Semilleros de Formación Dual    [  ] Pasantías Técnicas    [  ] Capacitación a la Medida</w:t>
             </w:r>
           </w:p>
         </w:tc>
@@ -4293,7 +4293,7 @@
         <w:color w:val="4A5568"/>
         <w:sz w:val="17"/>
       </w:rPr>
-      <w:t>Fundación Kinal | Programa Ejecutivo de Vinculación en Talento Técnico — Dosificación Oficial</w:t>
+      <w:t>Fundación Kinal | Programa Ejecutivo de Vinculación y Liderazgo — Dosificación Oficial</w:t>
     </w:r>
   </w:p>
 </w:ftr>

</xml_diff>

<commit_message>
feat(talento-tecnico): estructurar en 6 modulos con actividades evaluables e integrar validacion TSU
</commit_message>
<xml_diff>
--- a/Cursos/Talento_Tecnico/Dosificacion_y_Secuencia_Didactica_Talento_Tecnico_Kinal.docx
+++ b/Cursos/Talento_Tecnico/Dosificacion_y_Secuencia_Didactica_Talento_Tecnico_Kinal.docx
@@ -41,9 +41,11 @@
           <w:rFonts w:ascii="Calibri" w:hAnsi="Calibri"/>
           <w:i/>
           <w:color w:val="4A5568"/>
-          <w:sz w:val="21"/>
+          <w:sz w:val="20"/>
         </w:rPr>
-        <w:t>Cronograma Pedagógico Encuentro por Encuentro | 1 Mes de Duración | Modalidad Híbrida Ejecutiva (6 Encuentros: 2 Jornadas Presenciales Especiales en Kinal + 4 Sesiones Virtuales Semanales en Teams)</w:t>
+        <w:t>Cronograma Pedagógico Encuentro por Encuentro | 1 Mes de Duración | Organización Modular: Un Módulo por Sesión (6 Módulos / 6 Sesiones / 6 Actividades Evaluables)</w:t>
+        <w:br/>
+        <w:t>Modalidad Híbrida: 2 Jornadas Presenciales Especiales en Campus Kinal (8h) + 4 Sesiones Virtuales Semanales en Microsoft Teams (8h)</w:t>
       </w:r>
     </w:p>
     <w:tbl>
@@ -85,7 +87,7 @@
                 <w:color w:val="003366"/>
                 <w:sz w:val="19"/>
               </w:rPr>
-              <w:t xml:space="preserve">Organización Pedagógica Dual e Ideario Kinal: </w:t>
+              <w:t xml:space="preserve">Organización Pedagógica Modular e Ideario Kinal: </w:t>
             </w:r>
             <w:r>
               <w:rPr>
@@ -94,7 +96,7 @@
                 <w:color w:val="2D3748"/>
                 <w:sz w:val="19"/>
               </w:rPr>
-              <w:t>«El aprender en el proceso del trabajo es base y a la vez objetivo de la acción formativa». Las 16 horas de contacto directo sincrónico y presencial se estructuran a lo largo de un mes mediante 4 sesiones virtuales semanales de 2 horas en Microsoft Teams y 2 jornadas presenciales especiales de 4 horas en el campus de Fundación Kinal (Jornada Inicial de Apertura y Jornada de Cierre con Entrega de Diplomas y Reconocimientos). El programa genera un espacio formal de diálogo bidireccional industria-academia para identificar necesidades reales y dotar a los líderes de herramientas gerenciales en manejo de personal, liderazgo humanista, competencias operativas y desarrollo de mandos medios. Umbral aprobatorio institucional: 75 puntos sobre 100.</w:t>
+              <w:t>«El aprender en el proceso del trabajo es base y a la vez objetivo de la acción formativa». Las 16 horas de contacto sincrónico y presencial se organizan estrictamente en 6 Módulos Formativos (un módulo por sesión): 4 sesiones virtuales semanales de 2 horas en Microsoft Teams y 2 jornadas presenciales especiales de 4 horas en el campus de Fundación Kinal (Apertura y Clausura con entrega de Diplomas y Reconocimientos). Cada módulo integra una Actividad Formativa Evaluable orientada a la aplicación directa en la empresa. El programa articula el Factor Humano y consolida el Técnico Superior Universitario (TSU) como mecanismo riguroso de validación de competencias técnicas para la industria. Umbral aprobatorio institucional: 75 puntos sobre 100.</w:t>
             </w:r>
           </w:p>
         </w:tc>
@@ -117,7 +119,7 @@
           <w:color w:val="003366"/>
           <w:sz w:val="27"/>
         </w:rPr>
-        <w:t>1. Matriz General de Dosificación Cronológica (1 Mes — 6 Encuentros)</w:t>
+        <w:t>1. Matriz General de Dosificación Modular (1 Mes — 6 Módulos / 6 Sesiones)</w:t>
       </w:r>
     </w:p>
     <w:tbl>
@@ -136,9 +138,9 @@
         </w:tblBorders>
       </w:tblPr>
       <w:tblGrid>
-        <w:gridCol w:w="2016"/>
-        <w:gridCol w:w="2160"/>
-        <w:gridCol w:w="3168"/>
+        <w:gridCol w:w="1872"/>
+        <w:gridCol w:w="2592"/>
+        <w:gridCol w:w="2880"/>
         <w:gridCol w:w="2016"/>
       </w:tblGrid>
       <w:tr>
@@ -158,7 +160,7 @@
                 <w:color w:val="FFFFFF"/>
                 <w:sz w:val="17"/>
               </w:rPr>
-              <w:t>Encuentro / Formato</w:t>
+              <w:t>Módulo / Sesión</w:t>
             </w:r>
           </w:p>
         </w:tc>
@@ -178,7 +180,7 @@
                 <w:color w:val="FFFFFF"/>
                 <w:sz w:val="17"/>
               </w:rPr>
-              <w:t>Eje Temático</w:t>
+              <w:t>Eje / Tema Principal</w:t>
             </w:r>
           </w:p>
         </w:tc>
@@ -198,7 +200,7 @@
                 <w:color w:val="FFFFFF"/>
                 <w:sz w:val="17"/>
               </w:rPr>
-              <w:t>Contenido Central del Encuentro</w:t>
+              <w:t>Contenidos y Metodología Clave</w:t>
             </w:r>
           </w:p>
         </w:tc>
@@ -218,7 +220,7 @@
                 <w:color w:val="FFFFFF"/>
                 <w:sz w:val="17"/>
               </w:rPr>
-              <w:t>Producto Observable</w:t>
+              <w:t>Actividad Formativa Evaluable</w:t>
             </w:r>
           </w:p>
         </w:tc>
@@ -246,7 +248,9 @@
                 <w:color w:val="1A202C"/>
                 <w:sz w:val="16"/>
               </w:rPr>
-              <w:t>Jornada Especial 1 (Presencial)</w:t>
+              <w:t>Módulo 1</w:t>
+              <w:br/>
+              <w:t>(Presencial 1 • 4h)</w:t>
             </w:r>
           </w:p>
         </w:tc>
@@ -272,7 +276,7 @@
                 <w:color w:val="1A202C"/>
                 <w:sz w:val="16"/>
               </w:rPr>
-              <w:t>Apertura y Diálogo Inicial</w:t>
+              <w:t>Necesidades Actuales de la Industria y Diagnóstico del Talento Operativo</w:t>
             </w:r>
           </w:p>
         </w:tc>
@@ -298,7 +302,7 @@
                 <w:color w:val="1A202C"/>
                 <w:sz w:val="16"/>
               </w:rPr>
-              <w:t>Apertura institucional, presentación de la iniciativa, networking y Mesa de Diálogo 1: Necesidades de la industria y expectativas</w:t>
+              <w:t>Apertura institucional, presentación de iniciativa, networking, recorrido técnico y Mesa de Diálogo 1 sobre brechas operativas</w:t>
             </w:r>
           </w:p>
         </w:tc>
@@ -324,7 +328,7 @@
                 <w:color w:val="1A202C"/>
                 <w:sz w:val="16"/>
               </w:rPr>
-              <w:t>Ficha diagnóstica preliminar de necesidades y registro</w:t>
+              <w:t>Actividad 1: Matriz Diagnóstica de Necesidades Industriales y Brechas Técnicas de Planta (15 Pts)</w:t>
             </w:r>
           </w:p>
         </w:tc>
@@ -351,7 +355,9 @@
                 <w:color w:val="1A202C"/>
                 <w:sz w:val="16"/>
               </w:rPr>
-              <w:t>Sem. 1 / Sesión Virtual 1</w:t>
+              <w:t>Módulo 2</w:t>
+              <w:br/>
+              <w:t>(Virtual 1 • 2h)</w:t>
             </w:r>
           </w:p>
         </w:tc>
@@ -375,7 +381,7 @@
                 <w:color w:val="1A202C"/>
                 <w:sz w:val="16"/>
               </w:rPr>
-              <w:t>Manejo y Desarrollo de Personal</w:t>
+              <w:t>Manejo y Desarrollo de Personal Técnico en Planta</w:t>
             </w:r>
           </w:p>
         </w:tc>
@@ -399,7 +405,7 @@
                 <w:color w:val="1A202C"/>
                 <w:sz w:val="16"/>
               </w:rPr>
-              <w:t>Atracción por competencias, onboarding técnico acelerado (30-60-90 días), curvas de aprendizaje y reducción de rotación</w:t>
+              <w:t>Atracción por competencias, descriptores operativos rigurosos, onboarding acelerado (30-60-90 días) y reducción de rotación</w:t>
             </w:r>
           </w:p>
         </w:tc>
@@ -424,7 +430,7 @@
                 <w:color w:val="1A202C"/>
                 <w:sz w:val="16"/>
               </w:rPr>
-              <w:t>Descriptor de puesto técnico por competencias y plan de inducción</w:t>
+              <w:t>Actividad 2: Descriptor de Puesto Técnico por Competencias y Plan de Onboarding 30-60-90 Días (15 Pts)</w:t>
             </w:r>
           </w:p>
         </w:tc>
@@ -452,7 +458,9 @@
                 <w:color w:val="1A202C"/>
                 <w:sz w:val="16"/>
               </w:rPr>
-              <w:t>Sem. 2 / Sesión Virtual 2</w:t>
+              <w:t>Módulo 3</w:t>
+              <w:br/>
+              <w:t>(Virtual 2 • 2h)</w:t>
             </w:r>
           </w:p>
         </w:tc>
@@ -477,7 +485,7 @@
                 <w:color w:val="1A202C"/>
                 <w:sz w:val="16"/>
               </w:rPr>
-              <w:t>Liderazgo y Factor Humano</w:t>
+              <w:t>Liderazgo y Factor Humano en Cuadrillas de Trabajo</w:t>
             </w:r>
           </w:p>
         </w:tc>
@@ -502,7 +510,7 @@
                 <w:color w:val="1A202C"/>
                 <w:sz w:val="16"/>
               </w:rPr>
-              <w:t>Antropología de Kinal, los 4 pilares operativos, erradicación del maltrato en planta y fomento de seguridad psicológica</w:t>
+              <w:t>Filosofía del Factor Humano, los 4 pilares operativos de Kinal, erradicación del maltrato en planta y fomento de seguridad psicológica</w:t>
             </w:r>
           </w:p>
         </w:tc>
@@ -528,7 +536,7 @@
                 <w:color w:val="1A202C"/>
                 <w:sz w:val="16"/>
               </w:rPr>
-              <w:t>Código de convivencia operativa y protocolo cero maltrato</w:t>
+              <w:t>Actividad 3: Código de Convivencia Operativa y Protocolo de Seguridad Psicológica y Cero Maltrato (15 Pts)</w:t>
             </w:r>
           </w:p>
         </w:tc>
@@ -555,7 +563,9 @@
                 <w:color w:val="1A202C"/>
                 <w:sz w:val="16"/>
               </w:rPr>
-              <w:t>Sem. 3 / Sesión Virtual 3</w:t>
+              <w:t>Módulo 4</w:t>
+              <w:br/>
+              <w:t>(Virtual 3 • 2h)</w:t>
             </w:r>
           </w:p>
         </w:tc>
@@ -579,7 +589,7 @@
                 <w:color w:val="1A202C"/>
                 <w:sz w:val="16"/>
               </w:rPr>
-              <w:t>Fortalecimiento de Competencias</w:t>
+              <w:t>Fortalecimiento y Validación de Competencias: Nivel Técnico Superior (TSU)</w:t>
             </w:r>
           </w:p>
         </w:tc>
@@ -603,7 +613,7 @@
                 <w:color w:val="1A202C"/>
                 <w:sz w:val="16"/>
               </w:rPr>
-              <w:t>Mapeo de matrices de competencias operativas (saber, hacer, ser), evaluación práctica en puesto y aprendizaje continuo</w:t>
+              <w:t>Mapeo de matrices técnicas operativas (saber, hacer, ser), el TSU como mecanismo de validación y respaldo industrial, y evaluación en puesto</w:t>
             </w:r>
           </w:p>
         </w:tc>
@@ -628,7 +638,7 @@
                 <w:color w:val="1A202C"/>
                 <w:sz w:val="16"/>
               </w:rPr>
-              <w:t>Matriz de competencias técnicas operativas de planta</w:t>
+              <w:t>Actividad 4: Guía de Evaluación Práctica y Matriz de Validación Técnica bajo Estándar TSU (20 Pts)</w:t>
             </w:r>
           </w:p>
         </w:tc>
@@ -656,7 +666,9 @@
                 <w:color w:val="1A202C"/>
                 <w:sz w:val="16"/>
               </w:rPr>
-              <w:t>Sem. 4 / Sesión Virtual 4</w:t>
+              <w:t>Módulo 5</w:t>
+              <w:br/>
+              <w:t>(Virtual 4 • 2h)</w:t>
             </w:r>
           </w:p>
         </w:tc>
@@ -681,7 +693,7 @@
                 <w:color w:val="1A202C"/>
                 <w:sz w:val="16"/>
               </w:rPr>
-              <w:t>Desarrollo de Mandos Medios</w:t>
+              <w:t>Desarrollo de Mandos Medios y Supervisión de Primera Línea</w:t>
             </w:r>
           </w:p>
         </w:tc>
@@ -706,7 +718,7 @@
                 <w:color w:val="1A202C"/>
                 <w:sz w:val="16"/>
               </w:rPr>
-              <w:t>Herramientas para supervisores de primera línea, retroalimentación asertiva, micro-charlas de valores y KPIs (OEE/SSO)</w:t>
+              <w:t>Herramientas para supervisores de piso, retroalimentación asertiva, micro-charlas de valores de inicio de turno e impacto en KPIs (OEE/SSO)</w:t>
             </w:r>
           </w:p>
         </w:tc>
@@ -732,7 +744,7 @@
                 <w:color w:val="1A202C"/>
                 <w:sz w:val="16"/>
               </w:rPr>
-              <w:t>Catálogo de 5 micro-charlas de Factor Humano y ficha diagnóstica</w:t>
+              <w:t>Actividad 5: Plan de Coaching para Mandos Medios y Catálogo de 5 Micro-Charlas de Factor Humano (15 Pts)</w:t>
             </w:r>
           </w:p>
         </w:tc>
@@ -760,7 +772,9 @@
                 <w:color w:val="1A202C"/>
                 <w:sz w:val="16"/>
               </w:rPr>
-              <w:t>Jornada Especial 2 (Presencial)</w:t>
+              <w:t>Módulo 6</w:t>
+              <w:br/>
+              <w:t>(Presencial 2 • 4h)</w:t>
             </w:r>
           </w:p>
         </w:tc>
@@ -786,7 +800,7 @@
                 <w:color w:val="1A202C"/>
                 <w:sz w:val="16"/>
               </w:rPr>
-              <w:t>Plenaria y Clausura</w:t>
+              <w:t>Sistematización de Demandas, Acuerdos de Vinculación y Clausura</w:t>
             </w:r>
           </w:p>
         </w:tc>
@@ -812,7 +826,7 @@
                 <w:color w:val="1A202C"/>
                 <w:sz w:val="16"/>
               </w:rPr>
-              <w:t>Mesa Redonda Plenaria: Sistematización de necesidades de la industria, entrega solemne de diplomas y reconocimientos a empresas</w:t>
+              <w:t>Mesa Redonda Plenaria: Sistematización de demandas de la industria, convenios de cooperación técnica y entrega solemne de diplomas y distinciones</w:t>
             </w:r>
           </w:p>
         </w:tc>
@@ -838,7 +852,7 @@
                 <w:color w:val="1A202C"/>
                 <w:sz w:val="16"/>
               </w:rPr>
-              <w:t>Diplomas oficiales entregados y acuerdos de vinculación</w:t>
+              <w:t>Actividad 6: Sustentación Plenaria del Plan de Acción Empresarial y Firma de Acuerdos de Vinculación (20 Pts)</w:t>
             </w:r>
           </w:p>
         </w:tc>
@@ -861,7 +875,7 @@
           <w:color w:val="003366"/>
           <w:sz w:val="27"/>
         </w:rPr>
-        <w:t>2. Microdiseño Didáctico Detallado por Encuentro (6 Jornadas)</w:t>
+        <w:t>2. Microdiseño Didáctico Detallado por Módulos (6 Encuentros Formativos)</w:t>
       </w:r>
     </w:p>
     <w:p>
@@ -874,7 +888,7 @@
           <w:color w:val="1A202C"/>
           <w:sz w:val="19"/>
         </w:rPr>
-        <w:t>A continuación se desglosa la secuencia metodológica de cada encuentro formativo: 4 horas para las 2 jornadas presenciales especiales en campus Kinal y 2 horas para las 4 sesiones virtuales semanales en Microsoft Teams:</w:t>
+        <w:t>A continuación se desglosa la secuencia metodológica detallada para cada uno de los 6 Módulos Formativos (un módulo por sesión: 4 horas para las 2 jornadas presenciales en campus Kinal y 2 horas para las 4 sesiones virtuales semanales en Microsoft Teams):</w:t>
       </w:r>
     </w:p>
     <w:p>
@@ -887,9 +901,9 @@
           <w:rFonts w:ascii="Calibri" w:hAnsi="Calibri"/>
           <w:b/>
           <w:color w:val="003366"/>
-          <w:sz w:val="23"/>
+          <w:sz w:val="22"/>
         </w:rPr>
-        <w:t>Jornada Presencial Especial 1 (Campus Kinal) — Apertura Institucional, Presentación de la Iniciativa y Mesa de Diálogo 1: Necesidades de la Industria</w:t>
+        <w:t>Módulo 1: Necesidades Actuales de la Industria y Diagnóstico del Talento Operativo</w:t>
       </w:r>
     </w:p>
     <w:tbl>
@@ -934,7 +948,7 @@
                 <w:color w:val="003366"/>
                 <w:sz w:val="17"/>
               </w:rPr>
-              <w:t>Eje y Duración:</w:t>
+              <w:t>Formato y Duración:</w:t>
             </w:r>
           </w:p>
         </w:tc>
@@ -959,7 +973,7 @@
                 <w:color w:val="1A202C"/>
                 <w:sz w:val="17"/>
               </w:rPr>
-              <w:t>Apertura y Diálogo sobre Necesidades Industriales  |  4 Horas (240 min)</w:t>
+              <w:t>Jornada Presencial Especial 1 (Campus Kinal)  |  4 Horas (240 min)</w:t>
             </w:r>
           </w:p>
         </w:tc>
@@ -1011,7 +1025,7 @@
                 <w:color w:val="1A202C"/>
                 <w:sz w:val="17"/>
               </w:rPr>
-              <w:t>Conoce la visión formativa integral de Kinal, establece redes de contacto directivo y participa en el diagnóstico inicial sobre las necesidades de cualificación técnica en las empresas.</w:t>
+              <w:t>Conoce la visión formativa integral de Kinal, establece redes de contacto directivo y formaliza el diagnóstico inicial sobre las necesidades de cualificación y brechas técnicas operativas en las empresas.</w:t>
             </w:r>
           </w:p>
         </w:tc>
@@ -1063,7 +1077,7 @@
                 <w:color w:val="1A202C"/>
                 <w:sz w:val="17"/>
               </w:rPr>
-              <w:t>Apertura (30 min): Recepción protocolaria de los representantes empresariales en el Auditorio Ejecutivo de Fundación Kinal. Palabras de bienvenida a cargo de la Dirección de Vinculación y Dirección General. Encuadre de los objetivos del programa y dinámica de presentación de empresas participantes.</w:t>
+              <w:t>Apertura (30 min): Recepción protocolaria de los representantes empresariales en el Auditorio Ejecutivo de Fundación Kinal. Palabras de bienvenida a cargo de la Dirección de Vinculación y Dirección General. Encuadre de los objetivos del programa y dinámica de networking ejecutivo entre sectores productivos.</w:t>
             </w:r>
           </w:p>
         </w:tc>
@@ -1115,7 +1129,7 @@
                 <w:color w:val="1A202C"/>
                 <w:sz w:val="17"/>
               </w:rPr>
-              <w:t>Desarrollo (180 min con pausa activa de 20 min): Recorrido guiado por los talleres y laboratorios técnicos de Kinal (automatización, robótica, mecatrónica, electrónica y redes). Observación de metodologías de aprendizaje práctico. Mesa de Diálogo 1: conversatorio abierto entre gerentes y autoridades de Kinal sobre los principales retos en la gestión de personal operativo y las brechas de competencias más críticas en la industria.</w:t>
+              <w:t>Desarrollo (180 min con pausa activa de 20 min): Recorrido guiado por los talleres y laboratorios técnicos de Kinal (automatización, robótica, mecatrónica CNC, electrónica y redes). Observación de metodologías de aprendizaje práctico. Mesa de Diálogo 1: conversatorio abierto entre gerentes y autoridades de Kinal sobre los principales retos en la gestión de personal operativo y las brechas de competencias más críticas en la industria.</w:t>
             </w:r>
           </w:p>
         </w:tc>
@@ -1167,7 +1181,7 @@
                 <w:color w:val="1A202C"/>
                 <w:sz w:val="17"/>
               </w:rPr>
-              <w:t>Cierre (30 min): Plenaria de síntesis de la jornada, entrega de la Ficha Diagnóstica de Necesidades Industriales, encuadre para las sesiones en Microsoft Teams y Kinal.academy, y café de networking.</w:t>
+              <w:t>Cierre (30 min): Plenaria de síntesis de la jornada, encuadre para la plataforma Microsoft Teams y Kinal.academy, y entrega de pautas para la Matriz Diagnóstica.</w:t>
             </w:r>
           </w:p>
         </w:tc>
@@ -1247,7 +1261,7 @@
                 <w:color w:val="003366"/>
                 <w:sz w:val="17"/>
               </w:rPr>
-              <w:t>Entregable y Evidencia:</w:t>
+              <w:t>Actividad Formativa Evaluable:</w:t>
             </w:r>
           </w:p>
         </w:tc>
@@ -1272,7 +1286,7 @@
                 <w:color w:val="1A202C"/>
                 <w:sz w:val="17"/>
               </w:rPr>
-              <w:t>Ficha diagnóstica preliminar de necesidades y registro formal de participación.</w:t>
+              <w:t>Actividad Formativa Evaluable 1: Matriz Diagnóstica de Necesidades Industriales y Brechas Técnicas de Planta (identificación de puestos operativos críticos y tecnologías emergentes). Ponderación: 15 Puntos.</w:t>
             </w:r>
           </w:p>
         </w:tc>
@@ -1293,9 +1307,9 @@
           <w:rFonts w:ascii="Calibri" w:hAnsi="Calibri"/>
           <w:b/>
           <w:color w:val="003366"/>
-          <w:sz w:val="23"/>
+          <w:sz w:val="22"/>
         </w:rPr>
-        <w:t>Sesión Virtual 1 (Semana 1 — Microsoft Teams) — Atracción por Competencias, Inducción Técnica Acelerada (Onboarding) y Reducción de Rotación</w:t>
+        <w:t>Módulo 2: Manejo y Desarrollo de Personal Técnico en Planta</w:t>
       </w:r>
     </w:p>
     <w:tbl>
@@ -1340,7 +1354,7 @@
                 <w:color w:val="003366"/>
                 <w:sz w:val="17"/>
               </w:rPr>
-              <w:t>Eje y Duración:</w:t>
+              <w:t>Formato y Duración:</w:t>
             </w:r>
           </w:p>
         </w:tc>
@@ -1365,7 +1379,7 @@
                 <w:color w:val="1A202C"/>
                 <w:sz w:val="17"/>
               </w:rPr>
-              <w:t>Manejo y Desarrollo de Personal Técnico  |  2 Horas (120 min)</w:t>
+              <w:t>Sesión Virtual 1 (Semana 1 — Microsoft Teams)  |  2 Horas (120 min)</w:t>
             </w:r>
           </w:p>
         </w:tc>
@@ -1417,7 +1431,7 @@
                 <w:color w:val="1A202C"/>
                 <w:sz w:val="17"/>
               </w:rPr>
-              <w:t>Aplica técnicas contemporáneas para el reclutamiento operativo basado en competencias y estructura planes de inducción técnica acelerada que mitiguen la rotación temprana.</w:t>
+              <w:t>Aplica técnicas contemporáneas para el reclutamiento operativo basado en competencias demostrables y estructura planes de inducción técnica acelerada que mitiguen la rotación temprana.</w:t>
             </w:r>
           </w:p>
         </w:tc>
@@ -1573,7 +1587,7 @@
                 <w:color w:val="1A202C"/>
                 <w:sz w:val="17"/>
               </w:rPr>
-              <w:t>Cierre (15 min): Socialización de matrices mejoradas, conclusiones ejecutivas y asignación de la lectura sobre Factor Humano en Kinal.academy.</w:t>
+              <w:t>Cierre (15 min): Socialización de matrices mejoradas en plenaria, conclusiones ejecutivas y pautas para subir el entregable a Kinal.academy.</w:t>
             </w:r>
           </w:p>
         </w:tc>
@@ -1653,7 +1667,7 @@
                 <w:color w:val="003366"/>
                 <w:sz w:val="17"/>
               </w:rPr>
-              <w:t>Entregable y Evidencia:</w:t>
+              <w:t>Actividad Formativa Evaluable:</w:t>
             </w:r>
           </w:p>
         </w:tc>
@@ -1678,7 +1692,7 @@
                 <w:color w:val="1A202C"/>
                 <w:sz w:val="17"/>
               </w:rPr>
-              <w:t>Descriptor de puesto técnico por competencias demostrables y esquema de inducción acelerada.</w:t>
+              <w:t>Actividad Formativa Evaluable 2: Descriptor de Puesto Técnico por Competencias Demostrables y Plan de Onboarding Operativo en 30-60-90 Días. Ponderación: 15 Puntos.</w:t>
             </w:r>
           </w:p>
         </w:tc>
@@ -1699,9 +1713,9 @@
           <w:rFonts w:ascii="Calibri" w:hAnsi="Calibri"/>
           <w:b/>
           <w:color w:val="003366"/>
-          <w:sz w:val="23"/>
+          <w:sz w:val="22"/>
         </w:rPr>
-        <w:t>Sesión Virtual 2 (Semana 2 — Microsoft Teams) — Dignidad en el Trabajo, el Principio del «Trabajo Bien Hecho» y Erradicación del Maltrato</w:t>
+        <w:t>Módulo 3: Liderazgo y Factor Humano en Cuadrillas de Trabajo</w:t>
       </w:r>
     </w:p>
     <w:tbl>
@@ -1746,7 +1760,7 @@
                 <w:color w:val="003366"/>
                 <w:sz w:val="17"/>
               </w:rPr>
-              <w:t>Eje y Duración:</w:t>
+              <w:t>Formato y Duración:</w:t>
             </w:r>
           </w:p>
         </w:tc>
@@ -1771,7 +1785,7 @@
                 <w:color w:val="1A202C"/>
                 <w:sz w:val="17"/>
               </w:rPr>
-              <w:t>Liderazgo y Factor Humano en Cuadrillas  |  2 Horas (120 min)</w:t>
+              <w:t>Sesión Virtual 2 (Semana 2 — Microsoft Teams)  |  2 Horas (120 min)</w:t>
             </w:r>
           </w:p>
         </w:tc>
@@ -1875,7 +1889,7 @@
                 <w:color w:val="1A202C"/>
                 <w:sz w:val="17"/>
               </w:rPr>
-              <w:t>Apertura (15 min): Presentación del video testimonial: 'El valor de la persona en el trabajo técnico'. Reflexión sobre el trabajo como ámbito de dignidad y servicio.</w:t>
+              <w:t>Apertura (15 min): Presentación del video testimonial institucional: 'El valor de la persona en el trabajo técnico'. Reflexión grupal sobre el trabajo como ámbito de dignidad y servicio.</w:t>
             </w:r>
           </w:p>
         </w:tc>
@@ -1979,7 +1993,7 @@
                 <w:color w:val="1A202C"/>
                 <w:sz w:val="17"/>
               </w:rPr>
-              <w:t>Cierre (15 min): Síntesis de buenas prácticas de liderazgo, pautas para el protocolo de cero maltrato y preparación del siguiente eje en Kinal.academy.</w:t>
+              <w:t>Cierre (15 min): Síntesis de buenas prácticas de liderazgo, pautas para el protocolo de cero maltrato y consignas en Kinal.academy.</w:t>
             </w:r>
           </w:p>
         </w:tc>
@@ -2059,7 +2073,7 @@
                 <w:color w:val="003366"/>
                 <w:sz w:val="17"/>
               </w:rPr>
-              <w:t>Entregable y Evidencia:</w:t>
+              <w:t>Actividad Formativa Evaluable:</w:t>
             </w:r>
           </w:p>
         </w:tc>
@@ -2084,7 +2098,7 @@
                 <w:color w:val="1A202C"/>
                 <w:sz w:val="17"/>
               </w:rPr>
-              <w:t>Borrador de Código de Convivencia Operativa y Protocolo de Tolerancia Cero al Maltrato en Planta.</w:t>
+              <w:t>Actividad Formativa Evaluable 3: Borrador de Código de Convivencia Operativa y Protocolo de Seguridad Psicológica y Cero Tolerancia al Maltrato en Planta. Ponderación: 15 Puntos.</w:t>
             </w:r>
           </w:p>
         </w:tc>
@@ -2105,9 +2119,9 @@
           <w:rFonts w:ascii="Calibri" w:hAnsi="Calibri"/>
           <w:b/>
           <w:color w:val="003366"/>
-          <w:sz w:val="23"/>
+          <w:sz w:val="22"/>
         </w:rPr>
-        <w:t>Sesión Virtual 3 (Semana 3 — Microsoft Teams) — Mapeo de Matrices de Competencias Operativas, Evaluación Práctica y Aprendizaje Continuo</w:t>
+        <w:t>Módulo 4: Fortalecimiento y Validación de Competencias Técnicas: El Nivel Técnico Superior (TSU) como Respaldo Industrial</w:t>
       </w:r>
     </w:p>
     <w:tbl>
@@ -2152,7 +2166,7 @@
                 <w:color w:val="003366"/>
                 <w:sz w:val="17"/>
               </w:rPr>
-              <w:t>Eje y Duración:</w:t>
+              <w:t>Formato y Duración:</w:t>
             </w:r>
           </w:p>
         </w:tc>
@@ -2177,7 +2191,7 @@
                 <w:color w:val="1A202C"/>
                 <w:sz w:val="17"/>
               </w:rPr>
-              <w:t>Fortalecimiento de Competencias Técnicas  |  2 Horas (120 min)</w:t>
+              <w:t>Sesión Virtual 3 (Semana 3 — Microsoft Teams)  |  2 Horas (120 min)</w:t>
             </w:r>
           </w:p>
         </w:tc>
@@ -2229,7 +2243,7 @@
                 <w:color w:val="1A202C"/>
                 <w:sz w:val="17"/>
               </w:rPr>
-              <w:t>Diseña instrumentos objetivos para mapear y evaluar competencias técnicas operativas en el puesto de trabajo y estructura esquemas de aprendizaje continuo en la empresa.</w:t>
+              <w:t>Diseña instrumentos objetivos para mapear y evaluar competencias técnicas operativas y articula el nivel Técnico Superior (TSU) como mecanismo de validación rigurosa y respaldo para la industria.</w:t>
             </w:r>
           </w:p>
         </w:tc>
@@ -2281,7 +2295,7 @@
                 <w:color w:val="1A202C"/>
                 <w:sz w:val="17"/>
               </w:rPr>
-              <w:t>Apertura (15 min): Sondeo interactivo: '¿Cómo evalúa hoy en día si un operario realmente domina la calibración o diagnóstico de una máquina antes de asignarle la línea?'. Debate inicial.</w:t>
+              <w:t>Apertura (15 min): Sondeo interactivo: '¿Cómo evalúa hoy en día si un técnico domina el diagnóstico analítico de un PLC o sistema electromecánico antes de asignarle la línea crítica?'.</w:t>
             </w:r>
           </w:p>
         </w:tc>
@@ -2333,7 +2347,7 @@
                 <w:color w:val="1A202C"/>
                 <w:sz w:val="17"/>
               </w:rPr>
-              <w:t>Desarrollo (90 min con pausa de 10 min): Mapeo de matrices de competencias operativas bajo estándares internacionales. Diseño de pruebas de evaluación práctica en banco de trabajo (lectura de diagramas, uso de instrumentos y diagnóstico lógico de fallas). Esquemas de aprendizaje continuo en planta y el rol del mentor técnico (*Ausbilder*) para la transferencia de habilidades en el puesto.</w:t>
+              <w:t>Desarrollo (90 min con pausa de 10 min): Mapeo de competencias operativas bajo estándares internacionales (DQR). El Técnico Superior Universitario (TSU) como mecanismo riguroso de validación de competencias técnicas: acreditación de capacidades superiores en diagnóstico, interpretación de diagramas y cálculo aplicado. Por qué la industria requiere el respaldo del nivel superior técnico para cerrar la brecha entre ingeniería y piso de planta. Diseño de pruebas prácticas en banco de trabajo y el rol del mentor técnico (*Ausbilder*) para la transferencia en el puesto.</w:t>
             </w:r>
           </w:p>
         </w:tc>
@@ -2385,7 +2399,7 @@
                 <w:color w:val="1A202C"/>
                 <w:sz w:val="17"/>
               </w:rPr>
-              <w:t>Cierre (15 min): Pautas para la aplicación del instrumento de evaluación técnica en sus plantas y consignas de trabajo.</w:t>
+              <w:t>Cierre (15 min): Presentación de la matriz de validación técnica de planta y asignación del entregable en Kinal.academy.</w:t>
             </w:r>
           </w:p>
         </w:tc>
@@ -2437,7 +2451,7 @@
                 <w:color w:val="1A202C"/>
                 <w:sz w:val="17"/>
               </w:rPr>
-              <w:t>Microsoft Teams, matriz de competencias en Excel, guía de pruebas prácticas, Kinal.academy.</w:t>
+              <w:t>Microsoft Teams, marco curricular TSU Kinal, matriz de competencias técnicas en Excel, Kinal.academy.</w:t>
             </w:r>
           </w:p>
         </w:tc>
@@ -2465,7 +2479,7 @@
                 <w:color w:val="003366"/>
                 <w:sz w:val="17"/>
               </w:rPr>
-              <w:t>Entregable y Evidencia:</w:t>
+              <w:t>Actividad Formativa Evaluable:</w:t>
             </w:r>
           </w:p>
         </w:tc>
@@ -2490,7 +2504,7 @@
                 <w:color w:val="1A202C"/>
                 <w:sz w:val="17"/>
               </w:rPr>
-              <w:t>Matriz de competencias técnicas operativas y esquema de capacitación en puesto de trabajo.</w:t>
+              <w:t>Actividad Formativa Evaluable 4: Guía de Evaluación Práctica y Matriz de Validación Técnica de Planta bajo el Estándar de Competencias del Técnico Superior (TSU). Ponderación: 20 Puntos.</w:t>
             </w:r>
           </w:p>
         </w:tc>
@@ -2511,9 +2525,9 @@
           <w:rFonts w:ascii="Calibri" w:hAnsi="Calibri"/>
           <w:b/>
           <w:color w:val="003366"/>
-          <w:sz w:val="23"/>
+          <w:sz w:val="22"/>
         </w:rPr>
-        <w:t>Sesión Virtual 4 (Semana 4 — Microsoft Teams) — Herramientas para Supervisores de Primera Línea, Feedback Asertivo y Micro-Charlas de Valores</w:t>
+        <w:t>Módulo 5: Desarrollo de Mandos Medios y Supervisión de Primera Línea</w:t>
       </w:r>
     </w:p>
     <w:tbl>
@@ -2558,7 +2572,7 @@
                 <w:color w:val="003366"/>
                 <w:sz w:val="17"/>
               </w:rPr>
-              <w:t>Eje y Duración:</w:t>
+              <w:t>Formato y Duración:</w:t>
             </w:r>
           </w:p>
         </w:tc>
@@ -2583,7 +2597,7 @@
                 <w:color w:val="1A202C"/>
                 <w:sz w:val="17"/>
               </w:rPr>
-              <w:t>Desarrollo de Mandos Medios  |  2 Horas (120 min)</w:t>
+              <w:t>Sesión Virtual 4 (Semana 4 — Microsoft Teams)  |  2 Horas (120 min)</w:t>
             </w:r>
           </w:p>
         </w:tc>
@@ -2635,7 +2649,7 @@
                 <w:color w:val="1A202C"/>
                 <w:sz w:val="17"/>
               </w:rPr>
-              <w:t>Estructura un plan de fortalecimiento para mandos medios que vincule el liderazgo con indicadores operativos (OEE, SSO) y consolida la Ficha Diagnóstica de Necesidades Industriales.</w:t>
+              <w:t>Estructura un plan de fortalecimiento para mandos medios que vincule el liderazgo formativo con indicadores operativos (OEE, SSO) y consolida el plan de acción empresarial.</w:t>
             </w:r>
           </w:p>
         </w:tc>
@@ -2739,7 +2753,7 @@
                 <w:color w:val="1A202C"/>
                 <w:sz w:val="17"/>
               </w:rPr>
-              <w:t>Desarrollo (90 min con pausa de 10 min): Habilidades formativas para mandos medios: comunicación asertiva, retroalimentación correctiva sin humillar y manejo constructivo de conflictos en cuadrillas. Diseño y ejecución de 'Las Charlas de 10 Minutos de Factor Humano' antes de iniciar el turno. Correlación entre factor humano y KPIs de negocio (OEE, tasa de accidentes SSO y merma). Revisión final de la Ficha Diagnóstica de Necesidades Industriales.</w:t>
+              <w:t>Desarrollo (90 min con pausa de 10 min): Habilidades formativas para mandos medios: comunicación asertiva, retroalimentación correctiva sin humillar y manejo constructivo de conflictos en cuadrillas. Diseño y ejecución de 'Las Charlas de 10 Minutos de Factor Humano' antes de iniciar el turno. Correlación entre factor humano y KPIs de negocio (OEE, tasa de accidentes SSO y merma). Consolidación final de la propuesta de mejora técnica para la jornada de clausura.</w:t>
             </w:r>
           </w:p>
         </w:tc>
@@ -2791,7 +2805,7 @@
                 <w:color w:val="1A202C"/>
                 <w:sz w:val="17"/>
               </w:rPr>
-              <w:t>Cierre (15 min): Instrucciones protocolarias para la Jornada Presencial de Cierre, entrega de diplomas y reconocimientos en campus Kinal.</w:t>
+              <w:t>Cierre (15 min): Instrucciones protocolarias para la Jornada Presencial de Cierre, sustentación de planes y entrega de distinciones en campus Kinal.</w:t>
             </w:r>
           </w:p>
         </w:tc>
@@ -2843,7 +2857,7 @@
                 <w:color w:val="1A202C"/>
                 <w:sz w:val="17"/>
               </w:rPr>
-              <w:t>Microsoft Teams, guía de micro-charlas de valores, formato de diagnóstico de necesidades, Kinal.academy.</w:t>
+              <w:t>Microsoft Teams, guía de micro-charlas de valores, formato de consolidación de plan de acción, Kinal.academy.</w:t>
             </w:r>
           </w:p>
         </w:tc>
@@ -2871,7 +2885,7 @@
                 <w:color w:val="003366"/>
                 <w:sz w:val="17"/>
               </w:rPr>
-              <w:t>Entregable y Evidencia:</w:t>
+              <w:t>Actividad Formativa Evaluable:</w:t>
             </w:r>
           </w:p>
         </w:tc>
@@ -2896,7 +2910,7 @@
                 <w:color w:val="1A202C"/>
                 <w:sz w:val="17"/>
               </w:rPr>
-              <w:t>Catálogo de 5 micro-charlas de Factor Humano y Ficha Diagnóstica de Necesidades Industriales completada.</w:t>
+              <w:t>Actividad Formativa Evaluable 5: Plan de Coaching para Mandos Medios y Catálogo de 5 Micro-Charlas de Factor Humano para el Inicio de Turno (vinculadas a KPIs OEE/SSO). Ponderación: 15 Puntos.</w:t>
             </w:r>
           </w:p>
         </w:tc>
@@ -2917,9 +2931,9 @@
           <w:rFonts w:ascii="Calibri" w:hAnsi="Calibri"/>
           <w:b/>
           <w:color w:val="003366"/>
-          <w:sz w:val="23"/>
+          <w:sz w:val="22"/>
         </w:rPr>
-        <w:t>Jornada Presencial Especial 2 (Campus Kinal) — Mesa Redonda Plenaria: Sistematización de Necesidades Industriales, Diplomas y Reconocimientos</w:t>
+        <w:t>Módulo 6: Sistematización de Demandas Industriales, Acuerdos de Vinculación y Clausura</w:t>
       </w:r>
     </w:p>
     <w:tbl>
@@ -2964,7 +2978,7 @@
                 <w:color w:val="003366"/>
                 <w:sz w:val="17"/>
               </w:rPr>
-              <w:t>Eje y Duración:</w:t>
+              <w:t>Formato y Duración:</w:t>
             </w:r>
           </w:p>
         </w:tc>
@@ -2989,7 +3003,7 @@
                 <w:color w:val="1A202C"/>
                 <w:sz w:val="17"/>
               </w:rPr>
-              <w:t>Plenaria Industria-Academia y Clausura  |  4 Horas (240 min)</w:t>
+              <w:t>Jornada Presencial Especial 2 (Campus Kinal)  |  4 Horas (240 min)</w:t>
             </w:r>
           </w:p>
         </w:tc>
@@ -3041,7 +3055,7 @@
                 <w:color w:val="1A202C"/>
                 <w:sz w:val="17"/>
               </w:rPr>
-              <w:t>Participa activamente en la sistematización de demandas formativas de la industria y recibe el diploma de participación y reconocimiento corporativo de Fundación Kinal.</w:t>
+              <w:t>Participa activamente en la sustentación del plan de acción empresarial, la retroalimentación de planes curriculares de Kinal y recibe el diploma de participación y reconocimiento corporativo.</w:t>
             </w:r>
           </w:p>
         </w:tc>
@@ -3093,7 +3107,7 @@
                 <w:color w:val="1A202C"/>
                 <w:sz w:val="17"/>
               </w:rPr>
-              <w:t>Apertura (20 min): Bienvenida protocolaria en Auditorio Ejecutivo por el Consejo Directivo y Directores Académicos de Kinal.</w:t>
+              <w:t>Apertura (20 min): Bienvenida protocolaria en Auditorio Ejecutivo por el Consejo Directivo y Directores Académicos de Fundación Kinal.</w:t>
             </w:r>
           </w:p>
         </w:tc>
@@ -3145,7 +3159,7 @@
                 <w:color w:val="1A202C"/>
                 <w:sz w:val="17"/>
               </w:rPr>
-              <w:t>Desarrollo (190 min con pausa de 20 min): Mesa Redonda Plenaria: 'Construyendo el futuro de la educación técnica en Guatemala'. Presentación de los hallazgos consolidados de las fichas diagnósticas: qué competencias técnicas y humanas demanda prioritariamente el sector industrial. Diálogo abierto con las autoridades de Kinal para la retroalimentación de planes de estudio y actualización de carreras. Firma de compromisos y convenios marco de vinculación (bolsa de empleo y semilleros formativos).</w:t>
+              <w:t>Desarrollo (190 min con pausa de 20 min): Mesa Redonda Plenaria: 'Construyendo la Pertinencia Técnica de Guatemala'. Sustentación ejecutiva de los planes de acción y matrices diagnósticas por parte de los representantes empresariales. Diálogo abierto con las autoridades de Kinal para la retroalimentación de planes de estudio del nivel Técnico Superior y carreras técnicas. Formalización de acuerdos de cooperación institucional (bolsa de empleo prioritaria, semilleros y pasantías).</w:t>
             </w:r>
           </w:p>
         </w:tc>
@@ -3277,7 +3291,7 @@
                 <w:color w:val="003366"/>
                 <w:sz w:val="17"/>
               </w:rPr>
-              <w:t>Entregable y Evidencia:</w:t>
+              <w:t>Actividad Formativa Evaluable:</w:t>
             </w:r>
           </w:p>
         </w:tc>
@@ -3302,7 +3316,7 @@
                 <w:color w:val="1A202C"/>
                 <w:sz w:val="17"/>
               </w:rPr>
-              <w:t>Diplomas de Participación y Reconocimientos Empresariales oficialmente entregados (Acreditación institucional &gt;= 75 Pts).</w:t>
+              <w:t>Actividad Formativa Evaluable 6: Sustentación Plenaria del Plan de Acción Empresarial y Firma de Acuerdos de Vinculación Institucional. Ponderación: 20 Puntos.</w:t>
             </w:r>
           </w:p>
         </w:tc>
@@ -3330,7 +3344,7 @@
           <w:color w:val="003366"/>
           <w:sz w:val="27"/>
         </w:rPr>
-        <w:t>3. Instrumentos de Acreditación, Rúbrica y Ficha Diagnóstica de la Industria</w:t>
+        <w:t>3. Instrumentos de Acreditación, Rúbrica Modular y Matriz Diagnóstica</w:t>
       </w:r>
     </w:p>
     <w:tbl>
@@ -3381,7 +3395,7 @@
                 <w:color w:val="2D3748"/>
                 <w:sz w:val="19"/>
               </w:rPr>
-              <w:t>Para recibir el Diploma de Participación Individual y el Reconocimiento Empresarial Institucional de Fundación Kinal, el representante debe cumplir con un mínimo del 80% de asistencia sincrónica y alcanzar una calificación mínima de 75 puntos sobre 100 en la entrega de sus productos aplicativos y participación en las mesas de diálogo.</w:t>
+              <w:t>Para hacerse acreedor al Diploma de Participación Individual y al Reconocimiento Empresarial Institucional de Fundación Kinal, el representante debe cumplir con un mínimo del 80% de asistencia sincrónica y alcanzar una calificación mínima de 75 puntos sobre 100 en el consolidado de las 6 actividades formativas evaluables del programa.</w:t>
             </w:r>
           </w:p>
         </w:tc>
@@ -3402,9 +3416,9 @@
           <w:rFonts w:ascii="Calibri" w:hAnsi="Calibri"/>
           <w:b/>
           <w:color w:val="003366"/>
-          <w:sz w:val="23"/>
+          <w:sz w:val="22"/>
         </w:rPr>
-        <w:t>3.1 Rúbrica Analítica de Acreditación y Participación Ejecutiva (100 Puntos)</w:t>
+        <w:t>3.1 Rúbrica Analítica de las 6 Actividades Formativas Evaluables (100 Puntos Totales)</w:t>
       </w:r>
     </w:p>
     <w:tbl>
@@ -3424,8 +3438,8 @@
       </w:tblPr>
       <w:tblGrid>
         <w:gridCol w:w="2592"/>
-        <w:gridCol w:w="1440"/>
-        <w:gridCol w:w="3168"/>
+        <w:gridCol w:w="1296"/>
+        <w:gridCol w:w="3312"/>
         <w:gridCol w:w="2160"/>
       </w:tblGrid>
       <w:tr>
@@ -3445,7 +3459,7 @@
                 <w:color w:val="FFFFFF"/>
                 <w:sz w:val="17"/>
               </w:rPr>
-              <w:t>Criterio Evaluado</w:t>
+              <w:t>Actividad Formativa / Módulo</w:t>
             </w:r>
           </w:p>
         </w:tc>
@@ -3465,7 +3479,7 @@
                 <w:color w:val="FFFFFF"/>
                 <w:sz w:val="17"/>
               </w:rPr>
-              <w:t>Ponderación</w:t>
+              <w:t>Puntos</w:t>
             </w:r>
           </w:p>
         </w:tc>
@@ -3533,7 +3547,7 @@
                 <w:color w:val="1A202C"/>
                 <w:sz w:val="16"/>
               </w:rPr>
-              <w:t>Participación en Sesiones y Mesas de Diálogo</w:t>
+              <w:t>Módulo 1: Matriz Diagnóstica de Necesidades y Brechas</w:t>
             </w:r>
           </w:p>
         </w:tc>
@@ -3559,7 +3573,7 @@
                 <w:color w:val="1A202C"/>
                 <w:sz w:val="16"/>
               </w:rPr>
-              <w:t>25 Puntos</w:t>
+              <w:t>15 Puntos</w:t>
             </w:r>
           </w:p>
         </w:tc>
@@ -3584,7 +3598,7 @@
                 <w:color w:val="1A202C"/>
                 <w:sz w:val="16"/>
               </w:rPr>
-              <w:t>Participa activamente en las 2 jornadas presenciales y sesiones en Teams, aportando datos de la realidad operativa y participando en el diálogo.</w:t>
+              <w:t>Identifica con precisión puestos críticos, desfases de cualificación operativa y tecnologías emergentes de su planta.</w:t>
             </w:r>
           </w:p>
         </w:tc>
@@ -3609,7 +3623,7 @@
                 <w:color w:val="1A202C"/>
                 <w:sz w:val="16"/>
               </w:rPr>
-              <w:t>Inasistencia injustificada o participación pasiva sin retroalimentación al diálogo (&lt; 18.7 pts).</w:t>
+              <w:t>Diagnóstico genérico o superficial sin datos específicos de la realidad técnica de planta (&lt; 11.2 pts).</w:t>
             </w:r>
           </w:p>
         </w:tc>
@@ -3636,7 +3650,7 @@
                 <w:color w:val="1A202C"/>
                 <w:sz w:val="16"/>
               </w:rPr>
-              <w:t>Descriptor por Competencias y Plan de Inducción</w:t>
+              <w:t>Módulo 2: Descriptor por Competencias y Plan Onboarding</w:t>
             </w:r>
           </w:p>
         </w:tc>
@@ -3661,7 +3675,7 @@
                 <w:color w:val="1A202C"/>
                 <w:sz w:val="16"/>
               </w:rPr>
-              <w:t>25 Puntos</w:t>
+              <w:t>15 Puntos</w:t>
             </w:r>
           </w:p>
         </w:tc>
@@ -3685,7 +3699,7 @@
                 <w:color w:val="1A202C"/>
                 <w:sz w:val="16"/>
               </w:rPr>
-              <w:t>Redacta un descriptor técnico riguroso basado en competencias demostrables (saber, hacer, ser) y esquema de onboarding acelerado.</w:t>
+              <w:t>Estructura un descriptor técnico riguroso por competencias observables (saber, hacer, ser) y plan de inducción a 30-60-90 días.</w:t>
             </w:r>
           </w:p>
         </w:tc>
@@ -3709,7 +3723,7 @@
                 <w:color w:val="1A202C"/>
                 <w:sz w:val="16"/>
               </w:rPr>
-              <w:t>Descriptor genérico basado en requisitos burocráticos sin criterios de evaluación técnica (&lt; 18.7 pts).</w:t>
+              <w:t>Descriptor tradicional burocrático sin desglose de destrezas operativas ni curva de adaptación (&lt; 11.2 pts).</w:t>
             </w:r>
           </w:p>
         </w:tc>
@@ -3737,7 +3751,7 @@
                 <w:color w:val="1A202C"/>
                 <w:sz w:val="16"/>
               </w:rPr>
-              <w:t>Protocolo de Factor Humano y Micro-Charlas</w:t>
+              <w:t>Módulo 3: Código de Convivencia y Protocolo Cero Maltrato</w:t>
             </w:r>
           </w:p>
         </w:tc>
@@ -3763,7 +3777,7 @@
                 <w:color w:val="1A202C"/>
                 <w:sz w:val="16"/>
               </w:rPr>
-              <w:t>25 Puntos</w:t>
+              <w:t>15 Puntos</w:t>
             </w:r>
           </w:p>
         </w:tc>
@@ -3788,7 +3802,7 @@
                 <w:color w:val="1A202C"/>
                 <w:sz w:val="16"/>
               </w:rPr>
-              <w:t>Propone directrices claras de cero tolerancia al maltrato en planta, seguridad psicológica y diseña 5 micro-charlas de valores.</w:t>
+              <w:t>Establece normas claras de seguridad psicológica, canales de reporte de averías sin temor y erradicación del maltrato en cuadrilla.</w:t>
             </w:r>
           </w:p>
         </w:tc>
@@ -3813,7 +3827,7 @@
                 <w:color w:val="1A202C"/>
                 <w:sz w:val="16"/>
               </w:rPr>
-              <w:t>Planteamiento abstracto sin aplicación práctica a las dinámicas de taller o cuadrilla (&lt; 18.7 pts).</w:t>
+              <w:t>Directrices teóricas sin aplicabilidad directa a las dinámicas y tensiones del taller operativo (&lt; 11.2 pts).</w:t>
             </w:r>
           </w:p>
         </w:tc>
@@ -3840,7 +3854,7 @@
                 <w:color w:val="1A202C"/>
                 <w:sz w:val="16"/>
               </w:rPr>
-              <w:t>Ficha Diagnóstica de Necesidades Industriales</w:t>
+              <w:t>Módulo 4: Guía de Evaluación Práctica y Validación TSU</w:t>
             </w:r>
           </w:p>
         </w:tc>
@@ -3865,7 +3879,7 @@
                 <w:color w:val="1A202C"/>
                 <w:sz w:val="16"/>
               </w:rPr>
-              <w:t>25 Puntos</w:t>
+              <w:t>20 Puntos</w:t>
             </w:r>
           </w:p>
         </w:tc>
@@ -3889,7 +3903,7 @@
                 <w:color w:val="1A202C"/>
                 <w:sz w:val="16"/>
               </w:rPr>
-              <w:t>Aporta información detallada sobre las tecnologías emergentes, competencias técnicas y humanas demandadas en su sector para retroalimentar a Kinal.</w:t>
+              <w:t>Diseña una prueba práctica en banco de trabajo y utiliza el estándar Técnico Superior (TSU) como mecanismo de validación técnica rigurosa.</w:t>
             </w:r>
           </w:p>
         </w:tc>
@@ -3913,7 +3927,211 @@
                 <w:color w:val="1A202C"/>
                 <w:sz w:val="16"/>
               </w:rPr>
-              <w:t>Ficha incompleta, superficial o sin datos sobre las brechas reales de cualificación técnica (&lt; 18.7 pts).</w:t>
+              <w:t>Evaluación teórica tradicional sin pruebas de destreza manual o sin respaldo de competencias de nivel superior (&lt; 15.0 pts).</w:t>
+            </w:r>
+          </w:p>
+        </w:tc>
+      </w:tr>
+      <w:tr>
+        <w:tc>
+          <w:tcPr>
+            <w:tcW w:type="dxa" w:w="2340"/>
+            <w:shd w:fill="F7FAFC"/>
+            <w:tcMar>
+              <w:top w:w="50" w:type="dxa"/>
+              <w:left w:w="60" w:type="dxa"/>
+              <w:bottom w:w="50" w:type="dxa"/>
+              <w:right w:w="60" w:type="dxa"/>
+            </w:tcMar>
+          </w:tcPr>
+          <w:p>
+            <w:pPr>
+              <w:spacing w:before="0" w:after="0" w:line="276" w:lineRule="auto"/>
+            </w:pPr>
+            <w:r>
+              <w:rPr>
+                <w:rFonts w:ascii="Calibri" w:hAnsi="Calibri"/>
+                <w:b/>
+                <w:color w:val="1A202C"/>
+                <w:sz w:val="16"/>
+              </w:rPr>
+              <w:t>Módulo 5: Plan de Coaching y 5 Micro-Charlas de Factor Humano</w:t>
+            </w:r>
+          </w:p>
+        </w:tc>
+        <w:tc>
+          <w:tcPr>
+            <w:tcW w:type="dxa" w:w="2340"/>
+            <w:shd w:fill="F7FAFC"/>
+            <w:tcMar>
+              <w:top w:w="50" w:type="dxa"/>
+              <w:left w:w="60" w:type="dxa"/>
+              <w:bottom w:w="50" w:type="dxa"/>
+              <w:right w:w="60" w:type="dxa"/>
+            </w:tcMar>
+          </w:tcPr>
+          <w:p>
+            <w:pPr>
+              <w:spacing w:before="0" w:after="0" w:line="276" w:lineRule="auto"/>
+            </w:pPr>
+            <w:r>
+              <w:rPr>
+                <w:rFonts w:ascii="Calibri" w:hAnsi="Calibri"/>
+                <w:b/>
+                <w:color w:val="1A202C"/>
+                <w:sz w:val="16"/>
+              </w:rPr>
+              <w:t>15 Puntos</w:t>
+            </w:r>
+          </w:p>
+        </w:tc>
+        <w:tc>
+          <w:tcPr>
+            <w:tcW w:type="dxa" w:w="2340"/>
+            <w:shd w:fill="F7FAFC"/>
+            <w:tcMar>
+              <w:top w:w="50" w:type="dxa"/>
+              <w:left w:w="60" w:type="dxa"/>
+              <w:bottom w:w="50" w:type="dxa"/>
+              <w:right w:w="60" w:type="dxa"/>
+            </w:tcMar>
+          </w:tcPr>
+          <w:p>
+            <w:pPr>
+              <w:spacing w:before="0" w:after="0" w:line="276" w:lineRule="auto"/>
+            </w:pPr>
+            <w:r>
+              <w:rPr>
+                <w:rFonts w:ascii="Calibri" w:hAnsi="Calibri"/>
+                <w:color w:val="1A202C"/>
+                <w:sz w:val="16"/>
+              </w:rPr>
+              <w:t>Diseña 5 micro-charlas operativas de valores para inicio de turno vinculadas a KPIs medibles (OEE, reducción de accidentes SSO y merma).</w:t>
+            </w:r>
+          </w:p>
+        </w:tc>
+        <w:tc>
+          <w:tcPr>
+            <w:tcW w:type="dxa" w:w="2340"/>
+            <w:shd w:fill="F7FAFC"/>
+            <w:tcMar>
+              <w:top w:w="50" w:type="dxa"/>
+              <w:left w:w="60" w:type="dxa"/>
+              <w:bottom w:w="50" w:type="dxa"/>
+              <w:right w:w="60" w:type="dxa"/>
+            </w:tcMar>
+          </w:tcPr>
+          <w:p>
+            <w:pPr>
+              <w:spacing w:before="0" w:after="0" w:line="276" w:lineRule="auto"/>
+            </w:pPr>
+            <w:r>
+              <w:rPr>
+                <w:rFonts w:ascii="Calibri" w:hAnsi="Calibri"/>
+                <w:color w:val="1A202C"/>
+                <w:sz w:val="16"/>
+              </w:rPr>
+              <w:t>Charlas desvinculadas de la operación diaria o sin conexión con la mejora de indicadores de planta (&lt; 11.2 pts).</w:t>
+            </w:r>
+          </w:p>
+        </w:tc>
+      </w:tr>
+      <w:tr>
+        <w:tc>
+          <w:tcPr>
+            <w:tcW w:type="dxa" w:w="2340"/>
+            <w:tcMar>
+              <w:top w:w="50" w:type="dxa"/>
+              <w:left w:w="60" w:type="dxa"/>
+              <w:bottom w:w="50" w:type="dxa"/>
+              <w:right w:w="60" w:type="dxa"/>
+            </w:tcMar>
+          </w:tcPr>
+          <w:p>
+            <w:pPr>
+              <w:spacing w:before="0" w:after="0" w:line="276" w:lineRule="auto"/>
+            </w:pPr>
+            <w:r>
+              <w:rPr>
+                <w:rFonts w:ascii="Calibri" w:hAnsi="Calibri"/>
+                <w:b/>
+                <w:color w:val="1A202C"/>
+                <w:sz w:val="16"/>
+              </w:rPr>
+              <w:t>Módulo 6: Sustentación Plenaria y Acuerdos de Vinculación</w:t>
+            </w:r>
+          </w:p>
+        </w:tc>
+        <w:tc>
+          <w:tcPr>
+            <w:tcW w:type="dxa" w:w="2340"/>
+            <w:tcMar>
+              <w:top w:w="50" w:type="dxa"/>
+              <w:left w:w="60" w:type="dxa"/>
+              <w:bottom w:w="50" w:type="dxa"/>
+              <w:right w:w="60" w:type="dxa"/>
+            </w:tcMar>
+          </w:tcPr>
+          <w:p>
+            <w:pPr>
+              <w:spacing w:before="0" w:after="0" w:line="276" w:lineRule="auto"/>
+            </w:pPr>
+            <w:r>
+              <w:rPr>
+                <w:rFonts w:ascii="Calibri" w:hAnsi="Calibri"/>
+                <w:b/>
+                <w:color w:val="1A202C"/>
+                <w:sz w:val="16"/>
+              </w:rPr>
+              <w:t>20 Puntos</w:t>
+            </w:r>
+          </w:p>
+        </w:tc>
+        <w:tc>
+          <w:tcPr>
+            <w:tcW w:type="dxa" w:w="2340"/>
+            <w:tcMar>
+              <w:top w:w="50" w:type="dxa"/>
+              <w:left w:w="60" w:type="dxa"/>
+              <w:bottom w:w="50" w:type="dxa"/>
+              <w:right w:w="60" w:type="dxa"/>
+            </w:tcMar>
+          </w:tcPr>
+          <w:p>
+            <w:pPr>
+              <w:spacing w:before="0" w:after="0" w:line="276" w:lineRule="auto"/>
+            </w:pPr>
+            <w:r>
+              <w:rPr>
+                <w:rFonts w:ascii="Calibri" w:hAnsi="Calibri"/>
+                <w:color w:val="1A202C"/>
+                <w:sz w:val="16"/>
+              </w:rPr>
+              <w:t>Sustenta con solvencia el plan de acción en la mesa plenaria, aporta retroalimentación crítica a Kinal y formaliza acuerdos de vinculación.</w:t>
+            </w:r>
+          </w:p>
+        </w:tc>
+        <w:tc>
+          <w:tcPr>
+            <w:tcW w:type="dxa" w:w="2340"/>
+            <w:tcMar>
+              <w:top w:w="50" w:type="dxa"/>
+              <w:left w:w="60" w:type="dxa"/>
+              <w:bottom w:w="50" w:type="dxa"/>
+              <w:right w:w="60" w:type="dxa"/>
+            </w:tcMar>
+          </w:tcPr>
+          <w:p>
+            <w:pPr>
+              <w:spacing w:before="0" w:after="0" w:line="276" w:lineRule="auto"/>
+            </w:pPr>
+            <w:r>
+              <w:rPr>
+                <w:rFonts w:ascii="Calibri" w:hAnsi="Calibri"/>
+                <w:color w:val="1A202C"/>
+                <w:sz w:val="16"/>
+              </w:rPr>
+              <w:t>Participación pasiva en la plenaria sin aportes significativos a la vinculación escuela-empresa (&lt; 15.0 pts).</w:t>
             </w:r>
           </w:p>
         </w:tc>
@@ -3929,9 +4147,9 @@
           <w:rFonts w:ascii="Calibri" w:hAnsi="Calibri"/>
           <w:b/>
           <w:color w:val="003366"/>
-          <w:sz w:val="23"/>
+          <w:sz w:val="22"/>
         </w:rPr>
-        <w:t>3.2 Ficha Diagnóstica: Levantamiento de Necesidades Actuales de la Industria</w:t>
+        <w:t>3.2 Formato de Levantamiento: Matriz Diagnóstica de Necesidades Industriales</w:t>
       </w:r>
     </w:p>
     <w:tbl>

</xml_diff>

<commit_message>
feat(talento-tecnico): compactar programa a 4 sesiones de 2h (total 8h) con apertura de Factor Humano y clausura presencial
</commit_message>
<xml_diff>
--- a/Cursos/Talento_Tecnico/Dosificacion_y_Secuencia_Didactica_Talento_Tecnico_Kinal.docx
+++ b/Cursos/Talento_Tecnico/Dosificacion_y_Secuencia_Didactica_Talento_Tecnico_Kinal.docx
@@ -43,9 +43,11 @@
           <w:color w:val="4A5568"/>
           <w:sz w:val="20"/>
         </w:rPr>
-        <w:t>Cronograma Pedagógico Encuentro por Encuentro | 1 Mes de Duración | Organización Modular: Un Módulo por Sesión (6 Módulos / 6 Sesiones / 6 Actividades Evaluables)</w:t>
+        <w:t>Cronograma Pedagógico Encuentro por Encuentro | Total: 8 Horas Formativas Ejecutivas</w:t>
         <w:br/>
-        <w:t>Modalidad Híbrida: 2 Jornadas Presenciales Especiales en Campus Kinal (8h) + 4 Sesiones Virtuales Semanales en Microsoft Teams (8h)</w:t>
+        <w:t>Organización Modular: Un Módulo por Sesión de 2 Horas (4 Módulos / 4 Sesiones / 4 Actividades Evaluables de 25 Pts = 100 Pts Totales)</w:t>
+        <w:br/>
+        <w:t>Modalidad Híbrida: 2 Sesiones Presenciales en Campus Kinal (4h) + 2 Sesiones Virtuales en Microsoft Teams (4h)</w:t>
       </w:r>
     </w:p>
     <w:tbl>
@@ -96,7 +98,7 @@
                 <w:color w:val="2D3748"/>
                 <w:sz w:val="19"/>
               </w:rPr>
-              <w:t>«El aprender en el proceso del trabajo es base y a la vez objetivo de la acción formativa». Las 16 horas de contacto sincrónico y presencial se organizan estrictamente en 6 Módulos Formativos (un módulo por sesión): 4 sesiones virtuales semanales de 2 horas en Microsoft Teams y 2 jornadas presenciales especiales de 4 horas en el campus de Fundación Kinal (Apertura y Clausura con entrega de Diplomas y Reconocimientos). Cada módulo integra una Actividad Formativa Evaluable orientada a la aplicación directa en la empresa. El programa articula el Factor Humano y consolida el Técnico Superior Universitario (TSU) como mecanismo riguroso de validación de competencias técnicas para la industria. Umbral aprobatorio institucional: 75 puntos sobre 100.</w:t>
+              <w:t>«El aprender en el proceso del trabajo es base y a la vez objetivo de la acción formativa». Las 8 horas de formación se distribuyen estrictamente en 4 sesiones de 2 horas (un módulo por sesión): Sesión 1 Presencial en Kinal (Apertura y Factor Humano), Sesiones 2 y 3 Virtuales en Teams (Manejo de Personal, Mandos Medios y Validación Técnica Superior TSU), y Sesión 4 Presencial en Kinal (Sistematización y Clausura con entrega solemne de Diplomas y Reconocimientos). Cada módulo integra una Actividad Formativa Evaluable de 25 puntos orientada a la aplicación directa en la empresa. Umbral aprobatorio institucional: 75 puntos sobre 100.</w:t>
             </w:r>
           </w:p>
         </w:tc>
@@ -119,7 +121,7 @@
           <w:color w:val="003366"/>
           <w:sz w:val="27"/>
         </w:rPr>
-        <w:t>1. Matriz General de Dosificación Modular (1 Mes — 6 Módulos / 6 Sesiones)</w:t>
+        <w:t>1. Matriz General de Dosificación Modular (Total: 8 Horas — 4 Módulos / 4 Sesiones de 2h)</w:t>
       </w:r>
     </w:p>
     <w:tbl>
@@ -250,7 +252,7 @@
               </w:rPr>
               <w:t>Módulo 1</w:t>
               <w:br/>
-              <w:t>(Presencial 1 • 4h)</w:t>
+              <w:t>(Presencial 1 • 2h)</w:t>
             </w:r>
           </w:p>
         </w:tc>
@@ -276,7 +278,7 @@
                 <w:color w:val="1A202C"/>
                 <w:sz w:val="16"/>
               </w:rPr>
-              <w:t>Necesidades Actuales de la Industria y Diagnóstico del Talento Operativo</w:t>
+              <w:t>Apertura Institucional, Liderazgo y Factor Humano en Cuadrillas</w:t>
             </w:r>
           </w:p>
         </w:tc>
@@ -302,7 +304,7 @@
                 <w:color w:val="1A202C"/>
                 <w:sz w:val="16"/>
               </w:rPr>
-              <w:t>Apertura institucional, presentación de iniciativa, networking, recorrido técnico y Mesa de Diálogo 1 sobre brechas operativas</w:t>
+              <w:t>Apertura protocolaria, filosofía de Kinal, los 4 pilares del Factor Humano, erradicación del maltrato en planta y seguridad psicológica</w:t>
             </w:r>
           </w:p>
         </w:tc>
@@ -328,7 +330,7 @@
                 <w:color w:val="1A202C"/>
                 <w:sz w:val="16"/>
               </w:rPr>
-              <w:t>Actividad 1: Matriz Diagnóstica de Necesidades Industriales y Brechas Técnicas de Planta (15 Pts)</w:t>
+              <w:t>Actividad 1: Código de Convivencia Operativa y Protocolo de Seguridad Psicológica y Cero Maltrato (25 Pts)</w:t>
             </w:r>
           </w:p>
         </w:tc>
@@ -381,7 +383,7 @@
                 <w:color w:val="1A202C"/>
                 <w:sz w:val="16"/>
               </w:rPr>
-              <w:t>Manejo y Desarrollo de Personal Técnico en Planta</w:t>
+              <w:t>Manejo de Personal Técnico y Desarrollo de Mandos Medios en Planta</w:t>
             </w:r>
           </w:p>
         </w:tc>
@@ -405,7 +407,7 @@
                 <w:color w:val="1A202C"/>
                 <w:sz w:val="16"/>
               </w:rPr>
-              <w:t>Atracción por competencias, descriptores operativos rigurosos, onboarding acelerado (30-60-90 días) y reducción de rotación</w:t>
+              <w:t>Atracción por competencias, descriptores operativos, onboarding acelerado 30-60-90 días, feedback asertivo y micro-charlas de valores (KPIs OEE/SSO)</w:t>
             </w:r>
           </w:p>
         </w:tc>
@@ -430,7 +432,7 @@
                 <w:color w:val="1A202C"/>
                 <w:sz w:val="16"/>
               </w:rPr>
-              <w:t>Actividad 2: Descriptor de Puesto Técnico por Competencias y Plan de Onboarding 30-60-90 Días (15 Pts)</w:t>
+              <w:t>Actividad 2: Descriptor por Competencias, Plan Onboarding y Catálogo de 3 Micro-Charlas de Factor Humano (25 Pts)</w:t>
             </w:r>
           </w:p>
         </w:tc>
@@ -485,7 +487,7 @@
                 <w:color w:val="1A202C"/>
                 <w:sz w:val="16"/>
               </w:rPr>
-              <w:t>Liderazgo y Factor Humano en Cuadrillas de Trabajo</w:t>
+              <w:t>Fortalecimiento y Validación de Competencias: Nivel Técnico Superior (TSU)</w:t>
             </w:r>
           </w:p>
         </w:tc>
@@ -510,7 +512,7 @@
                 <w:color w:val="1A202C"/>
                 <w:sz w:val="16"/>
               </w:rPr>
-              <w:t>Filosofía del Factor Humano, los 4 pilares operativos de Kinal, erradicación del maltrato en planta y fomento de seguridad psicológica</w:t>
+              <w:t>Mapeo de matrices técnicas operativas (saber, hacer, ser), el TSU como mecanismo riguroso de validación y respaldo industrial, y evaluación en puesto</w:t>
             </w:r>
           </w:p>
         </w:tc>
@@ -536,215 +538,7 @@
                 <w:color w:val="1A202C"/>
                 <w:sz w:val="16"/>
               </w:rPr>
-              <w:t>Actividad 3: Código de Convivencia Operativa y Protocolo de Seguridad Psicológica y Cero Maltrato (15 Pts)</w:t>
-            </w:r>
-          </w:p>
-        </w:tc>
-      </w:tr>
-      <w:tr>
-        <w:tc>
-          <w:tcPr>
-            <w:tcW w:type="dxa" w:w="2340"/>
-            <w:tcMar>
-              <w:top w:w="45" w:type="dxa"/>
-              <w:left w:w="55" w:type="dxa"/>
-              <w:bottom w:w="45" w:type="dxa"/>
-              <w:right w:w="55" w:type="dxa"/>
-            </w:tcMar>
-          </w:tcPr>
-          <w:p>
-            <w:pPr>
-              <w:spacing w:before="0" w:after="0" w:line="276" w:lineRule="auto"/>
-            </w:pPr>
-            <w:r>
-              <w:rPr>
-                <w:rFonts w:ascii="Calibri" w:hAnsi="Calibri"/>
-                <w:b/>
-                <w:color w:val="1A202C"/>
-                <w:sz w:val="16"/>
-              </w:rPr>
-              <w:t>Módulo 4</w:t>
-              <w:br/>
-              <w:t>(Virtual 3 • 2h)</w:t>
-            </w:r>
-          </w:p>
-        </w:tc>
-        <w:tc>
-          <w:tcPr>
-            <w:tcW w:type="dxa" w:w="2340"/>
-            <w:tcMar>
-              <w:top w:w="45" w:type="dxa"/>
-              <w:left w:w="55" w:type="dxa"/>
-              <w:bottom w:w="45" w:type="dxa"/>
-              <w:right w:w="55" w:type="dxa"/>
-            </w:tcMar>
-          </w:tcPr>
-          <w:p>
-            <w:pPr>
-              <w:spacing w:before="0" w:after="0" w:line="276" w:lineRule="auto"/>
-            </w:pPr>
-            <w:r>
-              <w:rPr>
-                <w:rFonts w:ascii="Calibri" w:hAnsi="Calibri"/>
-                <w:color w:val="1A202C"/>
-                <w:sz w:val="16"/>
-              </w:rPr>
-              <w:t>Fortalecimiento y Validación de Competencias: Nivel Técnico Superior (TSU)</w:t>
-            </w:r>
-          </w:p>
-        </w:tc>
-        <w:tc>
-          <w:tcPr>
-            <w:tcW w:type="dxa" w:w="2340"/>
-            <w:tcMar>
-              <w:top w:w="45" w:type="dxa"/>
-              <w:left w:w="55" w:type="dxa"/>
-              <w:bottom w:w="45" w:type="dxa"/>
-              <w:right w:w="55" w:type="dxa"/>
-            </w:tcMar>
-          </w:tcPr>
-          <w:p>
-            <w:pPr>
-              <w:spacing w:before="0" w:after="0" w:line="276" w:lineRule="auto"/>
-            </w:pPr>
-            <w:r>
-              <w:rPr>
-                <w:rFonts w:ascii="Calibri" w:hAnsi="Calibri"/>
-                <w:color w:val="1A202C"/>
-                <w:sz w:val="16"/>
-              </w:rPr>
-              <w:t>Mapeo de matrices técnicas operativas (saber, hacer, ser), el TSU como mecanismo de validación y respaldo industrial, y evaluación en puesto</w:t>
-            </w:r>
-          </w:p>
-        </w:tc>
-        <w:tc>
-          <w:tcPr>
-            <w:tcW w:type="dxa" w:w="2340"/>
-            <w:tcMar>
-              <w:top w:w="45" w:type="dxa"/>
-              <w:left w:w="55" w:type="dxa"/>
-              <w:bottom w:w="45" w:type="dxa"/>
-              <w:right w:w="55" w:type="dxa"/>
-            </w:tcMar>
-          </w:tcPr>
-          <w:p>
-            <w:pPr>
-              <w:spacing w:before="0" w:after="0" w:line="276" w:lineRule="auto"/>
-            </w:pPr>
-            <w:r>
-              <w:rPr>
-                <w:rFonts w:ascii="Calibri" w:hAnsi="Calibri"/>
-                <w:b/>
-                <w:color w:val="1A202C"/>
-                <w:sz w:val="16"/>
-              </w:rPr>
-              <w:t>Actividad 4: Guía de Evaluación Práctica y Matriz de Validación Técnica bajo Estándar TSU (20 Pts)</w:t>
-            </w:r>
-          </w:p>
-        </w:tc>
-      </w:tr>
-      <w:tr>
-        <w:tc>
-          <w:tcPr>
-            <w:tcW w:type="dxa" w:w="2340"/>
-            <w:shd w:fill="F7FAFC"/>
-            <w:tcMar>
-              <w:top w:w="45" w:type="dxa"/>
-              <w:left w:w="55" w:type="dxa"/>
-              <w:bottom w:w="45" w:type="dxa"/>
-              <w:right w:w="55" w:type="dxa"/>
-            </w:tcMar>
-          </w:tcPr>
-          <w:p>
-            <w:pPr>
-              <w:spacing w:before="0" w:after="0" w:line="276" w:lineRule="auto"/>
-            </w:pPr>
-            <w:r>
-              <w:rPr>
-                <w:rFonts w:ascii="Calibri" w:hAnsi="Calibri"/>
-                <w:b/>
-                <w:color w:val="1A202C"/>
-                <w:sz w:val="16"/>
-              </w:rPr>
-              <w:t>Módulo 5</w:t>
-              <w:br/>
-              <w:t>(Virtual 4 • 2h)</w:t>
-            </w:r>
-          </w:p>
-        </w:tc>
-        <w:tc>
-          <w:tcPr>
-            <w:tcW w:type="dxa" w:w="2340"/>
-            <w:shd w:fill="F7FAFC"/>
-            <w:tcMar>
-              <w:top w:w="45" w:type="dxa"/>
-              <w:left w:w="55" w:type="dxa"/>
-              <w:bottom w:w="45" w:type="dxa"/>
-              <w:right w:w="55" w:type="dxa"/>
-            </w:tcMar>
-          </w:tcPr>
-          <w:p>
-            <w:pPr>
-              <w:spacing w:before="0" w:after="0" w:line="276" w:lineRule="auto"/>
-            </w:pPr>
-            <w:r>
-              <w:rPr>
-                <w:rFonts w:ascii="Calibri" w:hAnsi="Calibri"/>
-                <w:color w:val="1A202C"/>
-                <w:sz w:val="16"/>
-              </w:rPr>
-              <w:t>Desarrollo de Mandos Medios y Supervisión de Primera Línea</w:t>
-            </w:r>
-          </w:p>
-        </w:tc>
-        <w:tc>
-          <w:tcPr>
-            <w:tcW w:type="dxa" w:w="2340"/>
-            <w:shd w:fill="F7FAFC"/>
-            <w:tcMar>
-              <w:top w:w="45" w:type="dxa"/>
-              <w:left w:w="55" w:type="dxa"/>
-              <w:bottom w:w="45" w:type="dxa"/>
-              <w:right w:w="55" w:type="dxa"/>
-            </w:tcMar>
-          </w:tcPr>
-          <w:p>
-            <w:pPr>
-              <w:spacing w:before="0" w:after="0" w:line="276" w:lineRule="auto"/>
-            </w:pPr>
-            <w:r>
-              <w:rPr>
-                <w:rFonts w:ascii="Calibri" w:hAnsi="Calibri"/>
-                <w:color w:val="1A202C"/>
-                <w:sz w:val="16"/>
-              </w:rPr>
-              <w:t>Herramientas para supervisores de piso, retroalimentación asertiva, micro-charlas de valores de inicio de turno e impacto en KPIs (OEE/SSO)</w:t>
-            </w:r>
-          </w:p>
-        </w:tc>
-        <w:tc>
-          <w:tcPr>
-            <w:tcW w:type="dxa" w:w="2340"/>
-            <w:shd w:fill="F7FAFC"/>
-            <w:tcMar>
-              <w:top w:w="45" w:type="dxa"/>
-              <w:left w:w="55" w:type="dxa"/>
-              <w:bottom w:w="45" w:type="dxa"/>
-              <w:right w:w="55" w:type="dxa"/>
-            </w:tcMar>
-          </w:tcPr>
-          <w:p>
-            <w:pPr>
-              <w:spacing w:before="0" w:after="0" w:line="276" w:lineRule="auto"/>
-            </w:pPr>
-            <w:r>
-              <w:rPr>
-                <w:rFonts w:ascii="Calibri" w:hAnsi="Calibri"/>
-                <w:b/>
-                <w:color w:val="1A202C"/>
-                <w:sz w:val="16"/>
-              </w:rPr>
-              <w:t>Actividad 5: Plan de Coaching para Mandos Medios y Catálogo de 5 Micro-Charlas de Factor Humano (15 Pts)</w:t>
+              <w:t>Actividad 3: Guía de Evaluación Práctica en Puesto y Matriz de Validación Técnica bajo Estándar TSU (25 Pts)</w:t>
             </w:r>
           </w:p>
         </w:tc>
@@ -772,9 +566,9 @@
                 <w:color w:val="1A202C"/>
                 <w:sz w:val="16"/>
               </w:rPr>
-              <w:t>Módulo 6</w:t>
+              <w:t>Módulo 4</w:t>
               <w:br/>
-              <w:t>(Presencial 2 • 4h)</w:t>
+              <w:t>(Presencial 2 • 2h)</w:t>
             </w:r>
           </w:p>
         </w:tc>
@@ -800,7 +594,7 @@
                 <w:color w:val="1A202C"/>
                 <w:sz w:val="16"/>
               </w:rPr>
-              <w:t>Sistematización de Demandas, Acuerdos de Vinculación y Clausura</w:t>
+              <w:t>Sistematización de Demandas Industriales, Acuerdos de Vinculación y Clausura</w:t>
             </w:r>
           </w:p>
         </w:tc>
@@ -826,7 +620,7 @@
                 <w:color w:val="1A202C"/>
                 <w:sz w:val="16"/>
               </w:rPr>
-              <w:t>Mesa Redonda Plenaria: Sistematización de demandas de la industria, convenios de cooperación técnica y entrega solemne de diplomas y distinciones</w:t>
+              <w:t>Mesa Redonda Plenaria: Sistematización de demandas de la industria, convenios de cooperación escuela-empresa y entrega solemne de diplomas y distinciones</w:t>
             </w:r>
           </w:p>
         </w:tc>
@@ -852,7 +646,7 @@
                 <w:color w:val="1A202C"/>
                 <w:sz w:val="16"/>
               </w:rPr>
-              <w:t>Actividad 6: Sustentación Plenaria del Plan de Acción Empresarial y Firma de Acuerdos de Vinculación (20 Pts)</w:t>
+              <w:t>Actividad 4: Sustentación Plenaria de la Ficha Diagnóstica Empresarial y Firma de Acuerdos de Vinculación (25 Pts)</w:t>
             </w:r>
           </w:p>
         </w:tc>
@@ -875,7 +669,7 @@
           <w:color w:val="003366"/>
           <w:sz w:val="27"/>
         </w:rPr>
-        <w:t>2. Microdiseño Didáctico Detallado por Módulos (6 Encuentros Formativos)</w:t>
+        <w:t>2. Microdiseño Didáctico Detallado por Módulos (4 Encuentros de 2 Horas)</w:t>
       </w:r>
     </w:p>
     <w:p>
@@ -888,7 +682,7 @@
           <w:color w:val="1A202C"/>
           <w:sz w:val="19"/>
         </w:rPr>
-        <w:t>A continuación se desglosa la secuencia metodológica detallada para cada uno de los 6 Módulos Formativos (un módulo por sesión: 4 horas para las 2 jornadas presenciales en campus Kinal y 2 horas para las 4 sesiones virtuales semanales en Microsoft Teams):</w:t>
+        <w:t>A continuación se desglosa la secuencia metodológica detallada para cada uno de los 4 Módulos Formativos (un módulo por sesión de 2 horas / 120 minutos: 2 sesiones presenciales en campus Kinal y 2 sesiones virtuales en Microsoft Teams):</w:t>
       </w:r>
     </w:p>
     <w:p>
@@ -903,7 +697,7 @@
           <w:color w:val="003366"/>
           <w:sz w:val="22"/>
         </w:rPr>
-        <w:t>Módulo 1: Necesidades Actuales de la Industria y Diagnóstico del Talento Operativo</w:t>
+        <w:t>Módulo 1: Apertura Institucional, Liderazgo y Factor Humano en Cuadrillas de Trabajo</w:t>
       </w:r>
     </w:p>
     <w:tbl>
@@ -973,7 +767,7 @@
                 <w:color w:val="1A202C"/>
                 <w:sz w:val="17"/>
               </w:rPr>
-              <w:t>Jornada Presencial Especial 1 (Campus Kinal)  |  4 Horas (240 min)</w:t>
+              <w:t>Sesión Presencial 1 (Campus Kinal)  |  2 Horas (120 min)</w:t>
             </w:r>
           </w:p>
         </w:tc>
@@ -1025,7 +819,7 @@
                 <w:color w:val="1A202C"/>
                 <w:sz w:val="17"/>
               </w:rPr>
-              <w:t>Conoce la visión formativa integral de Kinal, establece redes de contacto directivo y formaliza el diagnóstico inicial sobre las necesidades de cualificación y brechas técnicas operativas en las empresas.</w:t>
+              <w:t>Conoce la visión formativa de Kinal e implementa la cultura del Factor Humano en cuadrillas operativas: respeto a la dignidad de la persona, erradicación del maltrato y seguridad psicológica.</w:t>
             </w:r>
           </w:p>
         </w:tc>
@@ -1077,7 +871,7 @@
                 <w:color w:val="1A202C"/>
                 <w:sz w:val="17"/>
               </w:rPr>
-              <w:t>Apertura (30 min): Recepción protocolaria de los representantes empresariales en el Auditorio Ejecutivo de Fundación Kinal. Palabras de bienvenida a cargo de la Dirección de Vinculación y Dirección General. Encuadre de los objetivos del programa y dinámica de networking ejecutivo entre sectores productivos.</w:t>
+              <w:t>Apertura (20 min): Bienvenida protocolaria por directores de Fundación Kinal en Auditorio Ejecutivo. Encuadre de la iniciativa de vinculación empresarial y dinámica de presentación de los líderes empresariales participantes.</w:t>
             </w:r>
           </w:p>
         </w:tc>
@@ -1129,7 +923,7 @@
                 <w:color w:val="1A202C"/>
                 <w:sz w:val="17"/>
               </w:rPr>
-              <w:t>Desarrollo (180 min con pausa activa de 20 min): Recorrido guiado por los talleres y laboratorios técnicos de Kinal (automatización, robótica, mecatrónica CNC, electrónica y redes). Observación de metodologías de aprendizaje práctico. Mesa de Diálogo 1: conversatorio abierto entre gerentes y autoridades de Kinal sobre los principales retos en la gestión de personal operativo y las brechas de competencias más críticas en la industria.</w:t>
+              <w:t>Desarrollo (85 min con pausa de 10 min): La filosofía del Factor Humano de Fundación Kinal y sus 4 pilares: Respeto a la Dignidad, El Trabajo Bien Hecho (orden 5S, custodia de maquinaria y calidad moral), Espíritu de Servicio y Libertad Responsable. Análisis del caso: 'El costo oculto del maltrato verbal y la supervisión autoritaria en planta'. Cómo generar seguridad psicológica para que los operarios reporten averías e incidentes inmediatamente sin temor a represalias.</w:t>
             </w:r>
           </w:p>
         </w:tc>
@@ -1181,7 +975,7 @@
                 <w:color w:val="1A202C"/>
                 <w:sz w:val="17"/>
               </w:rPr>
-              <w:t>Cierre (30 min): Plenaria de síntesis de la jornada, encuadre para la plataforma Microsoft Teams y Kinal.academy, y entrega de pautas para la Matriz Diagnóstica.</w:t>
+              <w:t>Cierre (15 min): Síntesis ejecutiva de buenas prácticas de liderazgo humanista, pautas para el Código de Convivencia y encuadre para la plataforma Microsoft Teams y Kinal.academy.</w:t>
             </w:r>
           </w:p>
         </w:tc>
@@ -1233,7 +1027,7 @@
                 <w:color w:val="1A202C"/>
                 <w:sz w:val="17"/>
               </w:rPr>
-              <w:t>Campus Fundación Kinal (Auditorio Ejecutivo y Complejo de Laboratorios Técnicos), guías impresas, estación de café.</w:t>
+              <w:t>Auditorio Ejecutivo de Fundación Kinal, material impreso de Factor Humano, estación de café.</w:t>
             </w:r>
           </w:p>
         </w:tc>
@@ -1286,7 +1080,7 @@
                 <w:color w:val="1A202C"/>
                 <w:sz w:val="17"/>
               </w:rPr>
-              <w:t>Actividad Formativa Evaluable 1: Matriz Diagnóstica de Necesidades Industriales y Brechas Técnicas de Planta (identificación de puestos operativos críticos y tecnologías emergentes). Ponderación: 15 Puntos.</w:t>
+              <w:t>Actividad Formativa Evaluable 1: Borrador de Código de Convivencia Operativa y Protocolo de Seguridad Psicológica y Cero Maltrato en Planta. Ponderación: 25 Puntos.</w:t>
             </w:r>
           </w:p>
         </w:tc>
@@ -1309,7 +1103,7 @@
           <w:color w:val="003366"/>
           <w:sz w:val="22"/>
         </w:rPr>
-        <w:t>Módulo 2: Manejo y Desarrollo de Personal Técnico en Planta</w:t>
+        <w:t>Módulo 2: Manejo de Personal Técnico y Desarrollo de Mandos Medios en Planta</w:t>
       </w:r>
     </w:p>
     <w:tbl>
@@ -1379,7 +1173,7 @@
                 <w:color w:val="1A202C"/>
                 <w:sz w:val="17"/>
               </w:rPr>
-              <w:t>Sesión Virtual 1 (Semana 1 — Microsoft Teams)  |  2 Horas (120 min)</w:t>
+              <w:t>Sesión Virtual 1 (Microsoft Teams)  |  2 Horas (120 min)</w:t>
             </w:r>
           </w:p>
         </w:tc>
@@ -1431,7 +1225,7 @@
                 <w:color w:val="1A202C"/>
                 <w:sz w:val="17"/>
               </w:rPr>
-              <w:t>Aplica técnicas contemporáneas para el reclutamiento operativo basado en competencias demostrables y estructura planes de inducción técnica acelerada que mitiguen la rotación temprana.</w:t>
+              <w:t>Aplica metodologías contemporáneas para el reclutamiento por competencias demostrables, estructura planes de onboarding técnico a 30-60-90 días y equipa a mandos medios con feedback formativo y micro-charlas de valores.</w:t>
             </w:r>
           </w:p>
         </w:tc>
@@ -1483,7 +1277,7 @@
                 <w:color w:val="1A202C"/>
                 <w:sz w:val="17"/>
               </w:rPr>
-              <w:t>Apertura (15 min): Bienvenida en Teams y pregunta detonante: '¿Cuánto le cuesta realmente a su organización la rotación de un colaborador técnico en los primeros 90 días?'. Discusión en el chat interactivo.</w:t>
+              <w:t>Apertura (15 min): Bienvenida en Teams y pregunta detonante: '¿Cuánto le cuesta realmente a su empresa la rotación temprana de un operario y qué impacto tiene el mando medio en su permanencia?'.</w:t>
             </w:r>
           </w:p>
         </w:tc>
@@ -1535,7 +1329,7 @@
                 <w:color w:val="1A202C"/>
                 <w:sz w:val="17"/>
               </w:rPr>
-              <w:t>Desarrollo (90 min con pausa de 10 min): Por qué fracasan los descriptores de puesto tradicionales en piso operativo. Diseño de matrices de competencias demostrables (saber, saber hacer y saber ser). Estructuración de la curva de aprendizaje en 30-60-90 días. Taller en salas de Teams: rediseño de un puesto técnico crítico para la empresa del participante.</w:t>
+              <w:t>Desarrollo (90 min con pausa de 10 min): Descriptores de puesto técnicos basados en competencias demostrables (saber, hacer y ser). Estructuración del plan de inducción técnica acelerada en 30-60-90 días para acortar la curva de aprendizaje y reducir mermas. El supervisor de primera línea como puente clave: retroalimentación asertiva sin humillar y diseño de 'Las Charlas de 10 Minutos de Factor Humano' antes del turno vinculadas a KPIs (OEE/SSO).</w:t>
             </w:r>
           </w:p>
         </w:tc>
@@ -1587,7 +1381,7 @@
                 <w:color w:val="1A202C"/>
                 <w:sz w:val="17"/>
               </w:rPr>
-              <w:t>Cierre (15 min): Socialización de matrices mejoradas en plenaria, conclusiones ejecutivas y pautas para subir el entregable a Kinal.academy.</w:t>
+              <w:t>Cierre (15 min): Plenaria de socialización de matrices, conclusiones ejecutivas y pautas para subir el entregable a Kinal.academy.</w:t>
             </w:r>
           </w:p>
         </w:tc>
@@ -1639,7 +1433,7 @@
                 <w:color w:val="1A202C"/>
                 <w:sz w:val="17"/>
               </w:rPr>
-              <w:t>Microsoft Teams, salas grupales de Teams, Kinal.academy, plantilla de descriptores de puesto.</w:t>
+              <w:t>Microsoft Teams, salas grupales de Teams, plantillas de descriptores y micro-charlas, Kinal.academy.</w:t>
             </w:r>
           </w:p>
         </w:tc>
@@ -1692,7 +1486,7 @@
                 <w:color w:val="1A202C"/>
                 <w:sz w:val="17"/>
               </w:rPr>
-              <w:t>Actividad Formativa Evaluable 2: Descriptor de Puesto Técnico por Competencias Demostrables y Plan de Onboarding Operativo en 30-60-90 Días. Ponderación: 15 Puntos.</w:t>
+              <w:t>Actividad Formativa Evaluable 2: Descriptor de Puesto Técnico por Competencias Demostrables, Plan de Onboarding 30-60-90 Días y Catálogo de 3 Micro-Charlas de Factor Humano. Ponderación: 25 Puntos.</w:t>
             </w:r>
           </w:p>
         </w:tc>
@@ -1715,7 +1509,7 @@
           <w:color w:val="003366"/>
           <w:sz w:val="22"/>
         </w:rPr>
-        <w:t>Módulo 3: Liderazgo y Factor Humano en Cuadrillas de Trabajo</w:t>
+        <w:t>Módulo 3: Fortalecimiento y Validación de Competencias: Nivel Técnico Superior (TSU)</w:t>
       </w:r>
     </w:p>
     <w:tbl>
@@ -1785,7 +1579,7 @@
                 <w:color w:val="1A202C"/>
                 <w:sz w:val="17"/>
               </w:rPr>
-              <w:t>Sesión Virtual 2 (Semana 2 — Microsoft Teams)  |  2 Horas (120 min)</w:t>
+              <w:t>Sesión Virtual 2 (Microsoft Teams)  |  2 Horas (120 min)</w:t>
             </w:r>
           </w:p>
         </w:tc>
@@ -1837,413 +1631,7 @@
                 <w:color w:val="1A202C"/>
                 <w:sz w:val="17"/>
               </w:rPr>
-              <w:t>Formula políticas y protocolos de liderazgo humanista para erradicar el maltrato en cuadrillas de taller y promover la excelencia y seguridad psicológica en las operaciones.</w:t>
-            </w:r>
-          </w:p>
-        </w:tc>
-      </w:tr>
-      <w:tr>
-        <w:tc>
-          <w:tcPr>
-            <w:tcW w:type="dxa" w:w="4680"/>
-            <w:shd w:fill="F7FAFC"/>
-            <w:tcMar>
-              <w:top w:w="50" w:type="dxa"/>
-              <w:left w:w="70" w:type="dxa"/>
-              <w:bottom w:w="50" w:type="dxa"/>
-              <w:right w:w="70" w:type="dxa"/>
-            </w:tcMar>
-          </w:tcPr>
-          <w:p>
-            <w:pPr>
-              <w:spacing w:before="0" w:after="0" w:line="276" w:lineRule="auto"/>
-            </w:pPr>
-            <w:r>
-              <w:rPr>
-                <w:rFonts w:ascii="Calibri" w:hAnsi="Calibri"/>
-                <w:b/>
-                <w:color w:val="003366"/>
-                <w:sz w:val="17"/>
-              </w:rPr>
-              <w:t>Secuencia Didáctica — Apertura:</w:t>
-            </w:r>
-          </w:p>
-        </w:tc>
-        <w:tc>
-          <w:tcPr>
-            <w:tcW w:type="dxa" w:w="4680"/>
-            <w:tcMar>
-              <w:top w:w="50" w:type="dxa"/>
-              <w:left w:w="70" w:type="dxa"/>
-              <w:bottom w:w="50" w:type="dxa"/>
-              <w:right w:w="70" w:type="dxa"/>
-            </w:tcMar>
-          </w:tcPr>
-          <w:p>
-            <w:pPr>
-              <w:spacing w:before="0" w:after="0" w:line="276" w:lineRule="auto"/>
-            </w:pPr>
-            <w:r>
-              <w:rPr>
-                <w:rFonts w:ascii="Calibri" w:hAnsi="Calibri"/>
-                <w:color w:val="1A202C"/>
-                <w:sz w:val="17"/>
-              </w:rPr>
-              <w:t>Apertura (15 min): Presentación del video testimonial institucional: 'El valor de la persona en el trabajo técnico'. Reflexión grupal sobre el trabajo como ámbito de dignidad y servicio.</w:t>
-            </w:r>
-          </w:p>
-        </w:tc>
-      </w:tr>
-      <w:tr>
-        <w:tc>
-          <w:tcPr>
-            <w:tcW w:type="dxa" w:w="4680"/>
-            <w:shd w:fill="F7FAFC"/>
-            <w:tcMar>
-              <w:top w:w="50" w:type="dxa"/>
-              <w:left w:w="70" w:type="dxa"/>
-              <w:bottom w:w="50" w:type="dxa"/>
-              <w:right w:w="70" w:type="dxa"/>
-            </w:tcMar>
-          </w:tcPr>
-          <w:p>
-            <w:pPr>
-              <w:spacing w:before="0" w:after="0" w:line="276" w:lineRule="auto"/>
-            </w:pPr>
-            <w:r>
-              <w:rPr>
-                <w:rFonts w:ascii="Calibri" w:hAnsi="Calibri"/>
-                <w:b/>
-                <w:color w:val="003366"/>
-                <w:sz w:val="17"/>
-              </w:rPr>
-              <w:t>Secuencia Didáctica — Desarrollo:</w:t>
-            </w:r>
-          </w:p>
-        </w:tc>
-        <w:tc>
-          <w:tcPr>
-            <w:tcW w:type="dxa" w:w="4680"/>
-            <w:tcMar>
-              <w:top w:w="50" w:type="dxa"/>
-              <w:left w:w="70" w:type="dxa"/>
-              <w:bottom w:w="50" w:type="dxa"/>
-              <w:right w:w="70" w:type="dxa"/>
-            </w:tcMar>
-          </w:tcPr>
-          <w:p>
-            <w:pPr>
-              <w:spacing w:before="0" w:after="0" w:line="276" w:lineRule="auto"/>
-            </w:pPr>
-            <w:r>
-              <w:rPr>
-                <w:rFonts w:ascii="Calibri" w:hAnsi="Calibri"/>
-                <w:color w:val="1A202C"/>
-                <w:sz w:val="17"/>
-              </w:rPr>
-              <w:t>Desarrollo (90 min con pausa de 10 min): La filosofía del Factor Humano de Fundación Kinal y sus 4 pilares: Respeto a la Dignidad, Trabajo Bien Hecho (orden 5S, custodia de maquinaria y precisión moral), Espíritu de Servicio y Libertad Responsable. Análisis del caso: 'El costo oculto de la supervisión autoritaria en planta'. Cómo generar seguridad psicológica para que los operarios reporten averías e incidentes inmediatamente sin temor a represalias.</w:t>
-            </w:r>
-          </w:p>
-        </w:tc>
-      </w:tr>
-      <w:tr>
-        <w:tc>
-          <w:tcPr>
-            <w:tcW w:type="dxa" w:w="4680"/>
-            <w:shd w:fill="F7FAFC"/>
-            <w:tcMar>
-              <w:top w:w="50" w:type="dxa"/>
-              <w:left w:w="70" w:type="dxa"/>
-              <w:bottom w:w="50" w:type="dxa"/>
-              <w:right w:w="70" w:type="dxa"/>
-            </w:tcMar>
-          </w:tcPr>
-          <w:p>
-            <w:pPr>
-              <w:spacing w:before="0" w:after="0" w:line="276" w:lineRule="auto"/>
-            </w:pPr>
-            <w:r>
-              <w:rPr>
-                <w:rFonts w:ascii="Calibri" w:hAnsi="Calibri"/>
-                <w:b/>
-                <w:color w:val="003366"/>
-                <w:sz w:val="17"/>
-              </w:rPr>
-              <w:t>Secuencia Didáctica — Cierre:</w:t>
-            </w:r>
-          </w:p>
-        </w:tc>
-        <w:tc>
-          <w:tcPr>
-            <w:tcW w:type="dxa" w:w="4680"/>
-            <w:tcMar>
-              <w:top w:w="50" w:type="dxa"/>
-              <w:left w:w="70" w:type="dxa"/>
-              <w:bottom w:w="50" w:type="dxa"/>
-              <w:right w:w="70" w:type="dxa"/>
-            </w:tcMar>
-          </w:tcPr>
-          <w:p>
-            <w:pPr>
-              <w:spacing w:before="0" w:after="0" w:line="276" w:lineRule="auto"/>
-            </w:pPr>
-            <w:r>
-              <w:rPr>
-                <w:rFonts w:ascii="Calibri" w:hAnsi="Calibri"/>
-                <w:color w:val="1A202C"/>
-                <w:sz w:val="17"/>
-              </w:rPr>
-              <w:t>Cierre (15 min): Síntesis de buenas prácticas de liderazgo, pautas para el protocolo de cero maltrato y consignas en Kinal.academy.</w:t>
-            </w:r>
-          </w:p>
-        </w:tc>
-      </w:tr>
-      <w:tr>
-        <w:tc>
-          <w:tcPr>
-            <w:tcW w:type="dxa" w:w="4680"/>
-            <w:shd w:fill="F7FAFC"/>
-            <w:tcMar>
-              <w:top w:w="50" w:type="dxa"/>
-              <w:left w:w="70" w:type="dxa"/>
-              <w:bottom w:w="50" w:type="dxa"/>
-              <w:right w:w="70" w:type="dxa"/>
-            </w:tcMar>
-          </w:tcPr>
-          <w:p>
-            <w:pPr>
-              <w:spacing w:before="0" w:after="0" w:line="276" w:lineRule="auto"/>
-            </w:pPr>
-            <w:r>
-              <w:rPr>
-                <w:rFonts w:ascii="Calibri" w:hAnsi="Calibri"/>
-                <w:b/>
-                <w:color w:val="003366"/>
-                <w:sz w:val="17"/>
-              </w:rPr>
-              <w:t>Recursos y Plataformas:</w:t>
-            </w:r>
-          </w:p>
-        </w:tc>
-        <w:tc>
-          <w:tcPr>
-            <w:tcW w:type="dxa" w:w="4680"/>
-            <w:tcMar>
-              <w:top w:w="50" w:type="dxa"/>
-              <w:left w:w="70" w:type="dxa"/>
-              <w:bottom w:w="50" w:type="dxa"/>
-              <w:right w:w="70" w:type="dxa"/>
-            </w:tcMar>
-          </w:tcPr>
-          <w:p>
-            <w:pPr>
-              <w:spacing w:before="0" w:after="0" w:line="276" w:lineRule="auto"/>
-            </w:pPr>
-            <w:r>
-              <w:rPr>
-                <w:rFonts w:ascii="Calibri" w:hAnsi="Calibri"/>
-                <w:color w:val="1A202C"/>
-                <w:sz w:val="17"/>
-              </w:rPr>
-              <w:t>Microsoft Teams, pizarras digitales, casos de estudio industrial de Kinal, Kinal.academy.</w:t>
-            </w:r>
-          </w:p>
-        </w:tc>
-      </w:tr>
-      <w:tr>
-        <w:tc>
-          <w:tcPr>
-            <w:tcW w:type="dxa" w:w="4680"/>
-            <w:shd w:fill="F7FAFC"/>
-            <w:tcMar>
-              <w:top w:w="50" w:type="dxa"/>
-              <w:left w:w="70" w:type="dxa"/>
-              <w:bottom w:w="50" w:type="dxa"/>
-              <w:right w:w="70" w:type="dxa"/>
-            </w:tcMar>
-          </w:tcPr>
-          <w:p>
-            <w:pPr>
-              <w:spacing w:before="0" w:after="0" w:line="276" w:lineRule="auto"/>
-            </w:pPr>
-            <w:r>
-              <w:rPr>
-                <w:rFonts w:ascii="Calibri" w:hAnsi="Calibri"/>
-                <w:b/>
-                <w:color w:val="003366"/>
-                <w:sz w:val="17"/>
-              </w:rPr>
-              <w:t>Actividad Formativa Evaluable:</w:t>
-            </w:r>
-          </w:p>
-        </w:tc>
-        <w:tc>
-          <w:tcPr>
-            <w:tcW w:type="dxa" w:w="4680"/>
-            <w:tcMar>
-              <w:top w:w="50" w:type="dxa"/>
-              <w:left w:w="70" w:type="dxa"/>
-              <w:bottom w:w="50" w:type="dxa"/>
-              <w:right w:w="70" w:type="dxa"/>
-            </w:tcMar>
-          </w:tcPr>
-          <w:p>
-            <w:pPr>
-              <w:spacing w:before="0" w:after="0" w:line="276" w:lineRule="auto"/>
-            </w:pPr>
-            <w:r>
-              <w:rPr>
-                <w:rFonts w:ascii="Calibri" w:hAnsi="Calibri"/>
-                <w:b/>
-                <w:color w:val="1A202C"/>
-                <w:sz w:val="17"/>
-              </w:rPr>
-              <w:t>Actividad Formativa Evaluable 3: Borrador de Código de Convivencia Operativa y Protocolo de Seguridad Psicológica y Cero Tolerancia al Maltrato en Planta. Ponderación: 15 Puntos.</w:t>
-            </w:r>
-          </w:p>
-        </w:tc>
-      </w:tr>
-    </w:tbl>
-    <w:p>
-      <w:pPr>
-        <w:spacing w:before="40" w:after="80" w:line="276" w:lineRule="auto"/>
-      </w:pPr>
-    </w:p>
-    <w:p>
-      <w:pPr>
-        <w:keepNext/>
-        <w:spacing w:before="200" w:after="80"/>
-      </w:pPr>
-      <w:r>
-        <w:rPr>
-          <w:rFonts w:ascii="Calibri" w:hAnsi="Calibri"/>
-          <w:b/>
-          <w:color w:val="003366"/>
-          <w:sz w:val="22"/>
-        </w:rPr>
-        <w:t>Módulo 4: Fortalecimiento y Validación de Competencias Técnicas: El Nivel Técnico Superior (TSU) como Respaldo Industrial</w:t>
-      </w:r>
-    </w:p>
-    <w:tbl>
-      <w:tblPr>
-        <w:tblW w:type="auto" w:w="0"/>
-        <w:jc w:val="center"/>
-        <w:tblLayout w:type="fixed"/>
-        <w:tblLook w:firstColumn="1" w:firstRow="1" w:lastColumn="0" w:lastRow="0" w:noHBand="0" w:noVBand="1" w:val="04A0"/>
-        <w:tblBorders>
-          <w:top w:val="single" w:sz="4" w:space="0" w:color="CBD5E0"/>
-          <w:bottom w:val="single" w:sz="4" w:space="0" w:color="CBD5E0"/>
-          <w:left w:val="none"/>
-          <w:right w:val="none"/>
-          <w:insideH w:val="single" w:sz="4" w:space="0" w:color="CBD5E0"/>
-          <w:insideV w:val="none"/>
-        </w:tblBorders>
-      </w:tblPr>
-      <w:tblGrid>
-        <w:gridCol w:w="2592"/>
-        <w:gridCol w:w="6768"/>
-      </w:tblGrid>
-      <w:tr>
-        <w:tc>
-          <w:tcPr>
-            <w:tcW w:type="dxa" w:w="4680"/>
-            <w:shd w:fill="F7FAFC"/>
-            <w:tcMar>
-              <w:top w:w="50" w:type="dxa"/>
-              <w:left w:w="70" w:type="dxa"/>
-              <w:bottom w:w="50" w:type="dxa"/>
-              <w:right w:w="70" w:type="dxa"/>
-            </w:tcMar>
-          </w:tcPr>
-          <w:p>
-            <w:pPr>
-              <w:spacing w:before="0" w:after="0" w:line="276" w:lineRule="auto"/>
-            </w:pPr>
-            <w:r>
-              <w:rPr>
-                <w:rFonts w:ascii="Calibri" w:hAnsi="Calibri"/>
-                <w:b/>
-                <w:color w:val="003366"/>
-                <w:sz w:val="17"/>
-              </w:rPr>
-              <w:t>Formato y Duración:</w:t>
-            </w:r>
-          </w:p>
-        </w:tc>
-        <w:tc>
-          <w:tcPr>
-            <w:tcW w:type="dxa" w:w="4680"/>
-            <w:tcMar>
-              <w:top w:w="50" w:type="dxa"/>
-              <w:left w:w="70" w:type="dxa"/>
-              <w:bottom w:w="50" w:type="dxa"/>
-              <w:right w:w="70" w:type="dxa"/>
-            </w:tcMar>
-          </w:tcPr>
-          <w:p>
-            <w:pPr>
-              <w:spacing w:before="0" w:after="0" w:line="276" w:lineRule="auto"/>
-            </w:pPr>
-            <w:r>
-              <w:rPr>
-                <w:rFonts w:ascii="Calibri" w:hAnsi="Calibri"/>
-                <w:b/>
-                <w:color w:val="1A202C"/>
-                <w:sz w:val="17"/>
-              </w:rPr>
-              <w:t>Sesión Virtual 3 (Semana 3 — Microsoft Teams)  |  2 Horas (120 min)</w:t>
-            </w:r>
-          </w:p>
-        </w:tc>
-      </w:tr>
-      <w:tr>
-        <w:tc>
-          <w:tcPr>
-            <w:tcW w:type="dxa" w:w="4680"/>
-            <w:shd w:fill="F7FAFC"/>
-            <w:tcMar>
-              <w:top w:w="50" w:type="dxa"/>
-              <w:left w:w="70" w:type="dxa"/>
-              <w:bottom w:w="50" w:type="dxa"/>
-              <w:right w:w="70" w:type="dxa"/>
-            </w:tcMar>
-          </w:tcPr>
-          <w:p>
-            <w:pPr>
-              <w:spacing w:before="0" w:after="0" w:line="276" w:lineRule="auto"/>
-            </w:pPr>
-            <w:r>
-              <w:rPr>
-                <w:rFonts w:ascii="Calibri" w:hAnsi="Calibri"/>
-                <w:b/>
-                <w:color w:val="003366"/>
-                <w:sz w:val="17"/>
-              </w:rPr>
-              <w:t>Objetivo Específico:</w:t>
-            </w:r>
-          </w:p>
-        </w:tc>
-        <w:tc>
-          <w:tcPr>
-            <w:tcW w:type="dxa" w:w="4680"/>
-            <w:tcMar>
-              <w:top w:w="50" w:type="dxa"/>
-              <w:left w:w="70" w:type="dxa"/>
-              <w:bottom w:w="50" w:type="dxa"/>
-              <w:right w:w="70" w:type="dxa"/>
-            </w:tcMar>
-          </w:tcPr>
-          <w:p>
-            <w:pPr>
-              <w:spacing w:before="0" w:after="0" w:line="276" w:lineRule="auto"/>
-            </w:pPr>
-            <w:r>
-              <w:rPr>
-                <w:rFonts w:ascii="Calibri" w:hAnsi="Calibri"/>
-                <w:color w:val="1A202C"/>
-                <w:sz w:val="17"/>
-              </w:rPr>
-              <w:t>Diseña instrumentos objetivos para mapear y evaluar competencias técnicas operativas y articula el nivel Técnico Superior (TSU) como mecanismo de validación rigurosa y respaldo para la industria.</w:t>
+              <w:t>Diseña instrumentos objetivos para mapear y evaluar competencias técnicas operativas y articula el nivel Técnico Superior (TSU) como mecanismo de validación rigurosa y respaldo objetivo para la industria.</w:t>
             </w:r>
           </w:p>
         </w:tc>
@@ -2504,7 +1892,7 @@
                 <w:color w:val="1A202C"/>
                 <w:sz w:val="17"/>
               </w:rPr>
-              <w:t>Actividad Formativa Evaluable 4: Guía de Evaluación Práctica y Matriz de Validación Técnica de Planta bajo el Estándar de Competencias del Técnico Superior (TSU). Ponderación: 20 Puntos.</w:t>
+              <w:t>Actividad Formativa Evaluable 3: Guía de Evaluación Práctica en Puesto y Matriz de Validación Técnica de Planta bajo el Estándar de Competencias del Técnico Superior (TSU). Ponderación: 25 Puntos.</w:t>
             </w:r>
           </w:p>
         </w:tc>
@@ -2527,413 +1915,7 @@
           <w:color w:val="003366"/>
           <w:sz w:val="22"/>
         </w:rPr>
-        <w:t>Módulo 5: Desarrollo de Mandos Medios y Supervisión de Primera Línea</w:t>
-      </w:r>
-    </w:p>
-    <w:tbl>
-      <w:tblPr>
-        <w:tblW w:type="auto" w:w="0"/>
-        <w:jc w:val="center"/>
-        <w:tblLayout w:type="fixed"/>
-        <w:tblLook w:firstColumn="1" w:firstRow="1" w:lastColumn="0" w:lastRow="0" w:noHBand="0" w:noVBand="1" w:val="04A0"/>
-        <w:tblBorders>
-          <w:top w:val="single" w:sz="4" w:space="0" w:color="CBD5E0"/>
-          <w:bottom w:val="single" w:sz="4" w:space="0" w:color="CBD5E0"/>
-          <w:left w:val="none"/>
-          <w:right w:val="none"/>
-          <w:insideH w:val="single" w:sz="4" w:space="0" w:color="CBD5E0"/>
-          <w:insideV w:val="none"/>
-        </w:tblBorders>
-      </w:tblPr>
-      <w:tblGrid>
-        <w:gridCol w:w="2592"/>
-        <w:gridCol w:w="6768"/>
-      </w:tblGrid>
-      <w:tr>
-        <w:tc>
-          <w:tcPr>
-            <w:tcW w:type="dxa" w:w="4680"/>
-            <w:shd w:fill="F7FAFC"/>
-            <w:tcMar>
-              <w:top w:w="50" w:type="dxa"/>
-              <w:left w:w="70" w:type="dxa"/>
-              <w:bottom w:w="50" w:type="dxa"/>
-              <w:right w:w="70" w:type="dxa"/>
-            </w:tcMar>
-          </w:tcPr>
-          <w:p>
-            <w:pPr>
-              <w:spacing w:before="0" w:after="0" w:line="276" w:lineRule="auto"/>
-            </w:pPr>
-            <w:r>
-              <w:rPr>
-                <w:rFonts w:ascii="Calibri" w:hAnsi="Calibri"/>
-                <w:b/>
-                <w:color w:val="003366"/>
-                <w:sz w:val="17"/>
-              </w:rPr>
-              <w:t>Formato y Duración:</w:t>
-            </w:r>
-          </w:p>
-        </w:tc>
-        <w:tc>
-          <w:tcPr>
-            <w:tcW w:type="dxa" w:w="4680"/>
-            <w:tcMar>
-              <w:top w:w="50" w:type="dxa"/>
-              <w:left w:w="70" w:type="dxa"/>
-              <w:bottom w:w="50" w:type="dxa"/>
-              <w:right w:w="70" w:type="dxa"/>
-            </w:tcMar>
-          </w:tcPr>
-          <w:p>
-            <w:pPr>
-              <w:spacing w:before="0" w:after="0" w:line="276" w:lineRule="auto"/>
-            </w:pPr>
-            <w:r>
-              <w:rPr>
-                <w:rFonts w:ascii="Calibri" w:hAnsi="Calibri"/>
-                <w:b/>
-                <w:color w:val="1A202C"/>
-                <w:sz w:val="17"/>
-              </w:rPr>
-              <w:t>Sesión Virtual 4 (Semana 4 — Microsoft Teams)  |  2 Horas (120 min)</w:t>
-            </w:r>
-          </w:p>
-        </w:tc>
-      </w:tr>
-      <w:tr>
-        <w:tc>
-          <w:tcPr>
-            <w:tcW w:type="dxa" w:w="4680"/>
-            <w:shd w:fill="F7FAFC"/>
-            <w:tcMar>
-              <w:top w:w="50" w:type="dxa"/>
-              <w:left w:w="70" w:type="dxa"/>
-              <w:bottom w:w="50" w:type="dxa"/>
-              <w:right w:w="70" w:type="dxa"/>
-            </w:tcMar>
-          </w:tcPr>
-          <w:p>
-            <w:pPr>
-              <w:spacing w:before="0" w:after="0" w:line="276" w:lineRule="auto"/>
-            </w:pPr>
-            <w:r>
-              <w:rPr>
-                <w:rFonts w:ascii="Calibri" w:hAnsi="Calibri"/>
-                <w:b/>
-                <w:color w:val="003366"/>
-                <w:sz w:val="17"/>
-              </w:rPr>
-              <w:t>Objetivo Específico:</w:t>
-            </w:r>
-          </w:p>
-        </w:tc>
-        <w:tc>
-          <w:tcPr>
-            <w:tcW w:type="dxa" w:w="4680"/>
-            <w:tcMar>
-              <w:top w:w="50" w:type="dxa"/>
-              <w:left w:w="70" w:type="dxa"/>
-              <w:bottom w:w="50" w:type="dxa"/>
-              <w:right w:w="70" w:type="dxa"/>
-            </w:tcMar>
-          </w:tcPr>
-          <w:p>
-            <w:pPr>
-              <w:spacing w:before="0" w:after="0" w:line="276" w:lineRule="auto"/>
-            </w:pPr>
-            <w:r>
-              <w:rPr>
-                <w:rFonts w:ascii="Calibri" w:hAnsi="Calibri"/>
-                <w:color w:val="1A202C"/>
-                <w:sz w:val="17"/>
-              </w:rPr>
-              <w:t>Estructura un plan de fortalecimiento para mandos medios que vincule el liderazgo formativo con indicadores operativos (OEE, SSO) y consolida el plan de acción empresarial.</w:t>
-            </w:r>
-          </w:p>
-        </w:tc>
-      </w:tr>
-      <w:tr>
-        <w:tc>
-          <w:tcPr>
-            <w:tcW w:type="dxa" w:w="4680"/>
-            <w:shd w:fill="F7FAFC"/>
-            <w:tcMar>
-              <w:top w:w="50" w:type="dxa"/>
-              <w:left w:w="70" w:type="dxa"/>
-              <w:bottom w:w="50" w:type="dxa"/>
-              <w:right w:w="70" w:type="dxa"/>
-            </w:tcMar>
-          </w:tcPr>
-          <w:p>
-            <w:pPr>
-              <w:spacing w:before="0" w:after="0" w:line="276" w:lineRule="auto"/>
-            </w:pPr>
-            <w:r>
-              <w:rPr>
-                <w:rFonts w:ascii="Calibri" w:hAnsi="Calibri"/>
-                <w:b/>
-                <w:color w:val="003366"/>
-                <w:sz w:val="17"/>
-              </w:rPr>
-              <w:t>Secuencia Didáctica — Apertura:</w:t>
-            </w:r>
-          </w:p>
-        </w:tc>
-        <w:tc>
-          <w:tcPr>
-            <w:tcW w:type="dxa" w:w="4680"/>
-            <w:tcMar>
-              <w:top w:w="50" w:type="dxa"/>
-              <w:left w:w="70" w:type="dxa"/>
-              <w:bottom w:w="50" w:type="dxa"/>
-              <w:right w:w="70" w:type="dxa"/>
-            </w:tcMar>
-          </w:tcPr>
-          <w:p>
-            <w:pPr>
-              <w:spacing w:before="0" w:after="0" w:line="276" w:lineRule="auto"/>
-            </w:pPr>
-            <w:r>
-              <w:rPr>
-                <w:rFonts w:ascii="Calibri" w:hAnsi="Calibri"/>
-                <w:color w:val="1A202C"/>
-                <w:sz w:val="17"/>
-              </w:rPr>
-              <w:t>Apertura (15 min): Encuadre: el supervisor de taller como puente crítico entre la dirección estratégica y el piso operativo.</w:t>
-            </w:r>
-          </w:p>
-        </w:tc>
-      </w:tr>
-      <w:tr>
-        <w:tc>
-          <w:tcPr>
-            <w:tcW w:type="dxa" w:w="4680"/>
-            <w:shd w:fill="F7FAFC"/>
-            <w:tcMar>
-              <w:top w:w="50" w:type="dxa"/>
-              <w:left w:w="70" w:type="dxa"/>
-              <w:bottom w:w="50" w:type="dxa"/>
-              <w:right w:w="70" w:type="dxa"/>
-            </w:tcMar>
-          </w:tcPr>
-          <w:p>
-            <w:pPr>
-              <w:spacing w:before="0" w:after="0" w:line="276" w:lineRule="auto"/>
-            </w:pPr>
-            <w:r>
-              <w:rPr>
-                <w:rFonts w:ascii="Calibri" w:hAnsi="Calibri"/>
-                <w:b/>
-                <w:color w:val="003366"/>
-                <w:sz w:val="17"/>
-              </w:rPr>
-              <w:t>Secuencia Didáctica — Desarrollo:</w:t>
-            </w:r>
-          </w:p>
-        </w:tc>
-        <w:tc>
-          <w:tcPr>
-            <w:tcW w:type="dxa" w:w="4680"/>
-            <w:tcMar>
-              <w:top w:w="50" w:type="dxa"/>
-              <w:left w:w="70" w:type="dxa"/>
-              <w:bottom w:w="50" w:type="dxa"/>
-              <w:right w:w="70" w:type="dxa"/>
-            </w:tcMar>
-          </w:tcPr>
-          <w:p>
-            <w:pPr>
-              <w:spacing w:before="0" w:after="0" w:line="276" w:lineRule="auto"/>
-            </w:pPr>
-            <w:r>
-              <w:rPr>
-                <w:rFonts w:ascii="Calibri" w:hAnsi="Calibri"/>
-                <w:color w:val="1A202C"/>
-                <w:sz w:val="17"/>
-              </w:rPr>
-              <w:t>Desarrollo (90 min con pausa de 10 min): Habilidades formativas para mandos medios: comunicación asertiva, retroalimentación correctiva sin humillar y manejo constructivo de conflictos en cuadrillas. Diseño y ejecución de 'Las Charlas de 10 Minutos de Factor Humano' antes de iniciar el turno. Correlación entre factor humano y KPIs de negocio (OEE, tasa de accidentes SSO y merma). Consolidación final de la propuesta de mejora técnica para la jornada de clausura.</w:t>
-            </w:r>
-          </w:p>
-        </w:tc>
-      </w:tr>
-      <w:tr>
-        <w:tc>
-          <w:tcPr>
-            <w:tcW w:type="dxa" w:w="4680"/>
-            <w:shd w:fill="F7FAFC"/>
-            <w:tcMar>
-              <w:top w:w="50" w:type="dxa"/>
-              <w:left w:w="70" w:type="dxa"/>
-              <w:bottom w:w="50" w:type="dxa"/>
-              <w:right w:w="70" w:type="dxa"/>
-            </w:tcMar>
-          </w:tcPr>
-          <w:p>
-            <w:pPr>
-              <w:spacing w:before="0" w:after="0" w:line="276" w:lineRule="auto"/>
-            </w:pPr>
-            <w:r>
-              <w:rPr>
-                <w:rFonts w:ascii="Calibri" w:hAnsi="Calibri"/>
-                <w:b/>
-                <w:color w:val="003366"/>
-                <w:sz w:val="17"/>
-              </w:rPr>
-              <w:t>Secuencia Didáctica — Cierre:</w:t>
-            </w:r>
-          </w:p>
-        </w:tc>
-        <w:tc>
-          <w:tcPr>
-            <w:tcW w:type="dxa" w:w="4680"/>
-            <w:tcMar>
-              <w:top w:w="50" w:type="dxa"/>
-              <w:left w:w="70" w:type="dxa"/>
-              <w:bottom w:w="50" w:type="dxa"/>
-              <w:right w:w="70" w:type="dxa"/>
-            </w:tcMar>
-          </w:tcPr>
-          <w:p>
-            <w:pPr>
-              <w:spacing w:before="0" w:after="0" w:line="276" w:lineRule="auto"/>
-            </w:pPr>
-            <w:r>
-              <w:rPr>
-                <w:rFonts w:ascii="Calibri" w:hAnsi="Calibri"/>
-                <w:color w:val="1A202C"/>
-                <w:sz w:val="17"/>
-              </w:rPr>
-              <w:t>Cierre (15 min): Instrucciones protocolarias para la Jornada Presencial de Cierre, sustentación de planes y entrega de distinciones en campus Kinal.</w:t>
-            </w:r>
-          </w:p>
-        </w:tc>
-      </w:tr>
-      <w:tr>
-        <w:tc>
-          <w:tcPr>
-            <w:tcW w:type="dxa" w:w="4680"/>
-            <w:shd w:fill="F7FAFC"/>
-            <w:tcMar>
-              <w:top w:w="50" w:type="dxa"/>
-              <w:left w:w="70" w:type="dxa"/>
-              <w:bottom w:w="50" w:type="dxa"/>
-              <w:right w:w="70" w:type="dxa"/>
-            </w:tcMar>
-          </w:tcPr>
-          <w:p>
-            <w:pPr>
-              <w:spacing w:before="0" w:after="0" w:line="276" w:lineRule="auto"/>
-            </w:pPr>
-            <w:r>
-              <w:rPr>
-                <w:rFonts w:ascii="Calibri" w:hAnsi="Calibri"/>
-                <w:b/>
-                <w:color w:val="003366"/>
-                <w:sz w:val="17"/>
-              </w:rPr>
-              <w:t>Recursos y Plataformas:</w:t>
-            </w:r>
-          </w:p>
-        </w:tc>
-        <w:tc>
-          <w:tcPr>
-            <w:tcW w:type="dxa" w:w="4680"/>
-            <w:tcMar>
-              <w:top w:w="50" w:type="dxa"/>
-              <w:left w:w="70" w:type="dxa"/>
-              <w:bottom w:w="50" w:type="dxa"/>
-              <w:right w:w="70" w:type="dxa"/>
-            </w:tcMar>
-          </w:tcPr>
-          <w:p>
-            <w:pPr>
-              <w:spacing w:before="0" w:after="0" w:line="276" w:lineRule="auto"/>
-            </w:pPr>
-            <w:r>
-              <w:rPr>
-                <w:rFonts w:ascii="Calibri" w:hAnsi="Calibri"/>
-                <w:color w:val="1A202C"/>
-                <w:sz w:val="17"/>
-              </w:rPr>
-              <w:t>Microsoft Teams, guía de micro-charlas de valores, formato de consolidación de plan de acción, Kinal.academy.</w:t>
-            </w:r>
-          </w:p>
-        </w:tc>
-      </w:tr>
-      <w:tr>
-        <w:tc>
-          <w:tcPr>
-            <w:tcW w:type="dxa" w:w="4680"/>
-            <w:shd w:fill="F7FAFC"/>
-            <w:tcMar>
-              <w:top w:w="50" w:type="dxa"/>
-              <w:left w:w="70" w:type="dxa"/>
-              <w:bottom w:w="50" w:type="dxa"/>
-              <w:right w:w="70" w:type="dxa"/>
-            </w:tcMar>
-          </w:tcPr>
-          <w:p>
-            <w:pPr>
-              <w:spacing w:before="0" w:after="0" w:line="276" w:lineRule="auto"/>
-            </w:pPr>
-            <w:r>
-              <w:rPr>
-                <w:rFonts w:ascii="Calibri" w:hAnsi="Calibri"/>
-                <w:b/>
-                <w:color w:val="003366"/>
-                <w:sz w:val="17"/>
-              </w:rPr>
-              <w:t>Actividad Formativa Evaluable:</w:t>
-            </w:r>
-          </w:p>
-        </w:tc>
-        <w:tc>
-          <w:tcPr>
-            <w:tcW w:type="dxa" w:w="4680"/>
-            <w:tcMar>
-              <w:top w:w="50" w:type="dxa"/>
-              <w:left w:w="70" w:type="dxa"/>
-              <w:bottom w:w="50" w:type="dxa"/>
-              <w:right w:w="70" w:type="dxa"/>
-            </w:tcMar>
-          </w:tcPr>
-          <w:p>
-            <w:pPr>
-              <w:spacing w:before="0" w:after="0" w:line="276" w:lineRule="auto"/>
-            </w:pPr>
-            <w:r>
-              <w:rPr>
-                <w:rFonts w:ascii="Calibri" w:hAnsi="Calibri"/>
-                <w:b/>
-                <w:color w:val="1A202C"/>
-                <w:sz w:val="17"/>
-              </w:rPr>
-              <w:t>Actividad Formativa Evaluable 5: Plan de Coaching para Mandos Medios y Catálogo de 5 Micro-Charlas de Factor Humano para el Inicio de Turno (vinculadas a KPIs OEE/SSO). Ponderación: 15 Puntos.</w:t>
-            </w:r>
-          </w:p>
-        </w:tc>
-      </w:tr>
-    </w:tbl>
-    <w:p>
-      <w:pPr>
-        <w:spacing w:before="40" w:after="80" w:line="276" w:lineRule="auto"/>
-      </w:pPr>
-    </w:p>
-    <w:p>
-      <w:pPr>
-        <w:keepNext/>
-        <w:spacing w:before="200" w:after="80"/>
-      </w:pPr>
-      <w:r>
-        <w:rPr>
-          <w:rFonts w:ascii="Calibri" w:hAnsi="Calibri"/>
-          <w:b/>
-          <w:color w:val="003366"/>
-          <w:sz w:val="22"/>
-        </w:rPr>
-        <w:t>Módulo 6: Sistematización de Demandas Industriales, Acuerdos de Vinculación y Clausura</w:t>
+        <w:t>Módulo 4: Sistematización de Demandas Industriales, Acuerdos de Vinculación y Clausura</w:t>
       </w:r>
     </w:p>
     <w:tbl>
@@ -3003,7 +1985,7 @@
                 <w:color w:val="1A202C"/>
                 <w:sz w:val="17"/>
               </w:rPr>
-              <w:t>Jornada Presencial Especial 2 (Campus Kinal)  |  4 Horas (240 min)</w:t>
+              <w:t>Sesión Presencial 2 (Campus Kinal)  |  2 Horas (120 min)</w:t>
             </w:r>
           </w:p>
         </w:tc>
@@ -3055,7 +2037,7 @@
                 <w:color w:val="1A202C"/>
                 <w:sz w:val="17"/>
               </w:rPr>
-              <w:t>Participa activamente en la sustentación del plan de acción empresarial, la retroalimentación de planes curriculares de Kinal y recibe el diploma de participación y reconocimiento corporativo.</w:t>
+              <w:t>Participa activamente en la sustentación de la ficha diagnóstica empresarial, la retroalimentación de planes curriculares de Kinal y recibe el diploma de participación individual y reconocimiento corporativo.</w:t>
             </w:r>
           </w:p>
         </w:tc>
@@ -3107,7 +2089,7 @@
                 <w:color w:val="1A202C"/>
                 <w:sz w:val="17"/>
               </w:rPr>
-              <w:t>Apertura (20 min): Bienvenida protocolaria en Auditorio Ejecutivo por el Consejo Directivo y Directores Académicos de Fundación Kinal.</w:t>
+              <w:t>Apertura (15 min): Bienvenida protocolaria en Auditorio Ejecutivo por el Consejo Directivo y Directores Académicos de Fundación Kinal.</w:t>
             </w:r>
           </w:p>
         </w:tc>
@@ -3159,7 +2141,7 @@
                 <w:color w:val="1A202C"/>
                 <w:sz w:val="17"/>
               </w:rPr>
-              <w:t>Desarrollo (190 min con pausa de 20 min): Mesa Redonda Plenaria: 'Construyendo la Pertinencia Técnica de Guatemala'. Sustentación ejecutiva de los planes de acción y matrices diagnósticas por parte de los representantes empresariales. Diálogo abierto con las autoridades de Kinal para la retroalimentación de planes de estudio del nivel Técnico Superior y carreras técnicas. Formalización de acuerdos de cooperación institucional (bolsa de empleo prioritaria, semilleros y pasantías).</w:t>
+              <w:t>Desarrollo (85 min con pausa de 10 min): Mesa Redonda Plenaria: 'Construyendo la Pertinencia Técnica de Guatemala'. Sustentación ejecutiva de las fichas diagnósticas por parte de los representantes empresariales. Diálogo abierto con las autoridades de Kinal para la retroalimentación de planes de estudio del nivel Técnico Superior y carreras técnicas. Formalización de acuerdos de cooperación institucional (bolsa de empleo prioritaria, semilleros y pasantías).</w:t>
             </w:r>
           </w:p>
         </w:tc>
@@ -3211,7 +2193,7 @@
                 <w:color w:val="1A202C"/>
                 <w:sz w:val="17"/>
               </w:rPr>
-              <w:t>Cierre (30 min): Acto solemne de clausura: Entrega de Diplomas de Participación Individual a los representantes empresariales y entrega de Reconocimientos Empresariales Especiales a las empresas aliadas. Brindis de honor y networking directivo.</w:t>
+              <w:t>Cierre (20 min): Acto solemne de clausura: Entrega de Diplomas de Participación Individual a los representantes empresariales y entrega de Reconocimientos Empresariales Especiales a las empresas aliadas. Brindis de honor y networking directivo.</w:t>
             </w:r>
           </w:p>
         </w:tc>
@@ -3263,7 +2245,7 @@
                 <w:color w:val="1A202C"/>
                 <w:sz w:val="17"/>
               </w:rPr>
-              <w:t>Auditorio Ejecutivo de Kinal, actas de evaluación, diplomas oficiales encuadernados, placas de reconocimiento empresarial, cóctel.</w:t>
+              <w:t>Auditorio Ejecutivo de Kinal, actas de evaluación, diplomas oficiales encuadernados, placas de reconocimiento empresarial, brindis de honor.</w:t>
             </w:r>
           </w:p>
         </w:tc>
@@ -3316,7 +2298,7 @@
                 <w:color w:val="1A202C"/>
                 <w:sz w:val="17"/>
               </w:rPr>
-              <w:t>Actividad Formativa Evaluable 6: Sustentación Plenaria del Plan de Acción Empresarial y Firma de Acuerdos de Vinculación Institucional. Ponderación: 20 Puntos.</w:t>
+              <w:t>Actividad Formativa Evaluable 4: Sustentación Plenaria de la Ficha Diagnóstica Empresarial y Firma de Acuerdos de Vinculación Institucional. Ponderación: 25 Puntos.</w:t>
             </w:r>
           </w:p>
         </w:tc>
@@ -3395,7 +2377,7 @@
                 <w:color w:val="2D3748"/>
                 <w:sz w:val="19"/>
               </w:rPr>
-              <w:t>Para hacerse acreedor al Diploma de Participación Individual y al Reconocimiento Empresarial Institucional de Fundación Kinal, el representante debe cumplir con un mínimo del 80% de asistencia sincrónica y alcanzar una calificación mínima de 75 puntos sobre 100 en el consolidado de las 6 actividades formativas evaluables del programa.</w:t>
+              <w:t>Para hacerse acreedor al Diploma de Participación Individual y al Reconocimiento Empresarial Institucional de Fundación Kinal, el representante debe cumplir con un mínimo del 80% de asistencia sincrónica y alcanzar una calificación mínima de 75 puntos sobre 100 en el consolidado de las 4 actividades formativas evaluables del programa (25 puntos cada una).</w:t>
             </w:r>
           </w:p>
         </w:tc>
@@ -3418,7 +2400,7 @@
           <w:color w:val="003366"/>
           <w:sz w:val="22"/>
         </w:rPr>
-        <w:t>3.1 Rúbrica Analítica de las 6 Actividades Formativas Evaluables (100 Puntos Totales)</w:t>
+        <w:t>3.1 Rúbrica Analítica de las 4 Actividades Formativas Evaluables (100 Puntos Totales)</w:t>
       </w:r>
     </w:p>
     <w:tbl>
@@ -3547,7 +2529,7 @@
                 <w:color w:val="1A202C"/>
                 <w:sz w:val="16"/>
               </w:rPr>
-              <w:t>Módulo 1: Matriz Diagnóstica de Necesidades y Brechas</w:t>
+              <w:t>Módulo 1: Código de Convivencia y Protocolo Cero Maltrato</w:t>
             </w:r>
           </w:p>
         </w:tc>
@@ -3573,7 +2555,7 @@
                 <w:color w:val="1A202C"/>
                 <w:sz w:val="16"/>
               </w:rPr>
-              <w:t>15 Puntos</w:t>
+              <w:t>25 Puntos</w:t>
             </w:r>
           </w:p>
         </w:tc>
@@ -3598,7 +2580,7 @@
                 <w:color w:val="1A202C"/>
                 <w:sz w:val="16"/>
               </w:rPr>
-              <w:t>Identifica con precisión puestos críticos, desfases de cualificación operativa y tecnologías emergentes de su planta.</w:t>
+              <w:t>Establece normas operativas de respeto, canales de reporte de averías sin temor y erradicación del maltrato en planta sustentadas en el Factor Humano.</w:t>
             </w:r>
           </w:p>
         </w:tc>
@@ -3623,7 +2605,7 @@
                 <w:color w:val="1A202C"/>
                 <w:sz w:val="16"/>
               </w:rPr>
-              <w:t>Diagnóstico genérico o superficial sin datos específicos de la realidad técnica de planta (&lt; 11.2 pts).</w:t>
+              <w:t>Directrices abstractas sin aplicabilidad directa a las dinámicas y tensiones del taller operativo (&lt; 18.7 pts).</w:t>
             </w:r>
           </w:p>
         </w:tc>
@@ -3650,7 +2632,7 @@
                 <w:color w:val="1A202C"/>
                 <w:sz w:val="16"/>
               </w:rPr>
-              <w:t>Módulo 2: Descriptor por Competencias y Plan Onboarding</w:t>
+              <w:t>Módulo 2: Descriptor por Competencias, Onboarding y 3 Micro-Charlas</w:t>
             </w:r>
           </w:p>
         </w:tc>
@@ -3675,7 +2657,7 @@
                 <w:color w:val="1A202C"/>
                 <w:sz w:val="16"/>
               </w:rPr>
-              <w:t>15 Puntos</w:t>
+              <w:t>25 Puntos</w:t>
             </w:r>
           </w:p>
         </w:tc>
@@ -3699,7 +2681,7 @@
                 <w:color w:val="1A202C"/>
                 <w:sz w:val="16"/>
               </w:rPr>
-              <w:t>Estructura un descriptor técnico riguroso por competencias observables (saber, hacer, ser) y plan de inducción a 30-60-90 días.</w:t>
+              <w:t>Estructura un descriptor por competencias observables, plan de onboarding a 30-60-90 días y 3 micro-charlas de valores vinculadas a KPIs OEE/SSO.</w:t>
             </w:r>
           </w:p>
         </w:tc>
@@ -3723,7 +2705,7 @@
                 <w:color w:val="1A202C"/>
                 <w:sz w:val="16"/>
               </w:rPr>
-              <w:t>Descriptor tradicional burocrático sin desglose de destrezas operativas ni curva de adaptación (&lt; 11.2 pts).</w:t>
+              <w:t>Descriptor tradicional burocrático sin desglose de destrezas operativas o charlas desvinculadas de planta (&lt; 18.7 pts).</w:t>
             </w:r>
           </w:p>
         </w:tc>
@@ -3751,7 +2733,7 @@
                 <w:color w:val="1A202C"/>
                 <w:sz w:val="16"/>
               </w:rPr>
-              <w:t>Módulo 3: Código de Convivencia y Protocolo Cero Maltrato</w:t>
+              <w:t>Módulo 3: Guía de Evaluación Práctica y Validación TSU</w:t>
             </w:r>
           </w:p>
         </w:tc>
@@ -3777,7 +2759,7 @@
                 <w:color w:val="1A202C"/>
                 <w:sz w:val="16"/>
               </w:rPr>
-              <w:t>15 Puntos</w:t>
+              <w:t>25 Puntos</w:t>
             </w:r>
           </w:p>
         </w:tc>
@@ -3802,7 +2784,7 @@
                 <w:color w:val="1A202C"/>
                 <w:sz w:val="16"/>
               </w:rPr>
-              <w:t>Establece normas claras de seguridad psicológica, canales de reporte de averías sin temor y erradicación del maltrato en cuadrilla.</w:t>
+              <w:t>Diseña una prueba práctica en banco de trabajo y utiliza el estándar Técnico Superior (TSU) como mecanismo de validación técnica rigurosa.</w:t>
             </w:r>
           </w:p>
         </w:tc>
@@ -3827,7 +2809,7 @@
                 <w:color w:val="1A202C"/>
                 <w:sz w:val="16"/>
               </w:rPr>
-              <w:t>Directrices teóricas sin aplicabilidad directa a las dinámicas y tensiones del taller operativo (&lt; 11.2 pts).</w:t>
+              <w:t>Evaluación teórica tradicional sin pruebas de destreza manual o sin respaldo de competencias de nivel superior (&lt; 18.7 pts).</w:t>
             </w:r>
           </w:p>
         </w:tc>
@@ -3854,7 +2836,7 @@
                 <w:color w:val="1A202C"/>
                 <w:sz w:val="16"/>
               </w:rPr>
-              <w:t>Módulo 4: Guía de Evaluación Práctica y Validación TSU</w:t>
+              <w:t>Módulo 4: Sustentación Plenaria y Acuerdos de Vinculación</w:t>
             </w:r>
           </w:p>
         </w:tc>
@@ -3879,7 +2861,7 @@
                 <w:color w:val="1A202C"/>
                 <w:sz w:val="16"/>
               </w:rPr>
-              <w:t>20 Puntos</w:t>
+              <w:t>25 Puntos</w:t>
             </w:r>
           </w:p>
         </w:tc>
@@ -3903,7 +2885,7 @@
                 <w:color w:val="1A202C"/>
                 <w:sz w:val="16"/>
               </w:rPr>
-              <w:t>Diseña una prueba práctica en banco de trabajo y utiliza el estándar Técnico Superior (TSU) como mecanismo de validación técnica rigurosa.</w:t>
+              <w:t>Sustenta con solvencia la ficha diagnóstica en la plenaria, aporta retroalimentación crítica a Kinal y formaliza acuerdos de vinculación.</w:t>
             </w:r>
           </w:p>
         </w:tc>
@@ -3927,211 +2909,7 @@
                 <w:color w:val="1A202C"/>
                 <w:sz w:val="16"/>
               </w:rPr>
-              <w:t>Evaluación teórica tradicional sin pruebas de destreza manual o sin respaldo de competencias de nivel superior (&lt; 15.0 pts).</w:t>
-            </w:r>
-          </w:p>
-        </w:tc>
-      </w:tr>
-      <w:tr>
-        <w:tc>
-          <w:tcPr>
-            <w:tcW w:type="dxa" w:w="2340"/>
-            <w:shd w:fill="F7FAFC"/>
-            <w:tcMar>
-              <w:top w:w="50" w:type="dxa"/>
-              <w:left w:w="60" w:type="dxa"/>
-              <w:bottom w:w="50" w:type="dxa"/>
-              <w:right w:w="60" w:type="dxa"/>
-            </w:tcMar>
-          </w:tcPr>
-          <w:p>
-            <w:pPr>
-              <w:spacing w:before="0" w:after="0" w:line="276" w:lineRule="auto"/>
-            </w:pPr>
-            <w:r>
-              <w:rPr>
-                <w:rFonts w:ascii="Calibri" w:hAnsi="Calibri"/>
-                <w:b/>
-                <w:color w:val="1A202C"/>
-                <w:sz w:val="16"/>
-              </w:rPr>
-              <w:t>Módulo 5: Plan de Coaching y 5 Micro-Charlas de Factor Humano</w:t>
-            </w:r>
-          </w:p>
-        </w:tc>
-        <w:tc>
-          <w:tcPr>
-            <w:tcW w:type="dxa" w:w="2340"/>
-            <w:shd w:fill="F7FAFC"/>
-            <w:tcMar>
-              <w:top w:w="50" w:type="dxa"/>
-              <w:left w:w="60" w:type="dxa"/>
-              <w:bottom w:w="50" w:type="dxa"/>
-              <w:right w:w="60" w:type="dxa"/>
-            </w:tcMar>
-          </w:tcPr>
-          <w:p>
-            <w:pPr>
-              <w:spacing w:before="0" w:after="0" w:line="276" w:lineRule="auto"/>
-            </w:pPr>
-            <w:r>
-              <w:rPr>
-                <w:rFonts w:ascii="Calibri" w:hAnsi="Calibri"/>
-                <w:b/>
-                <w:color w:val="1A202C"/>
-                <w:sz w:val="16"/>
-              </w:rPr>
-              <w:t>15 Puntos</w:t>
-            </w:r>
-          </w:p>
-        </w:tc>
-        <w:tc>
-          <w:tcPr>
-            <w:tcW w:type="dxa" w:w="2340"/>
-            <w:shd w:fill="F7FAFC"/>
-            <w:tcMar>
-              <w:top w:w="50" w:type="dxa"/>
-              <w:left w:w="60" w:type="dxa"/>
-              <w:bottom w:w="50" w:type="dxa"/>
-              <w:right w:w="60" w:type="dxa"/>
-            </w:tcMar>
-          </w:tcPr>
-          <w:p>
-            <w:pPr>
-              <w:spacing w:before="0" w:after="0" w:line="276" w:lineRule="auto"/>
-            </w:pPr>
-            <w:r>
-              <w:rPr>
-                <w:rFonts w:ascii="Calibri" w:hAnsi="Calibri"/>
-                <w:color w:val="1A202C"/>
-                <w:sz w:val="16"/>
-              </w:rPr>
-              <w:t>Diseña 5 micro-charlas operativas de valores para inicio de turno vinculadas a KPIs medibles (OEE, reducción de accidentes SSO y merma).</w:t>
-            </w:r>
-          </w:p>
-        </w:tc>
-        <w:tc>
-          <w:tcPr>
-            <w:tcW w:type="dxa" w:w="2340"/>
-            <w:shd w:fill="F7FAFC"/>
-            <w:tcMar>
-              <w:top w:w="50" w:type="dxa"/>
-              <w:left w:w="60" w:type="dxa"/>
-              <w:bottom w:w="50" w:type="dxa"/>
-              <w:right w:w="60" w:type="dxa"/>
-            </w:tcMar>
-          </w:tcPr>
-          <w:p>
-            <w:pPr>
-              <w:spacing w:before="0" w:after="0" w:line="276" w:lineRule="auto"/>
-            </w:pPr>
-            <w:r>
-              <w:rPr>
-                <w:rFonts w:ascii="Calibri" w:hAnsi="Calibri"/>
-                <w:color w:val="1A202C"/>
-                <w:sz w:val="16"/>
-              </w:rPr>
-              <w:t>Charlas desvinculadas de la operación diaria o sin conexión con la mejora de indicadores de planta (&lt; 11.2 pts).</w:t>
-            </w:r>
-          </w:p>
-        </w:tc>
-      </w:tr>
-      <w:tr>
-        <w:tc>
-          <w:tcPr>
-            <w:tcW w:type="dxa" w:w="2340"/>
-            <w:tcMar>
-              <w:top w:w="50" w:type="dxa"/>
-              <w:left w:w="60" w:type="dxa"/>
-              <w:bottom w:w="50" w:type="dxa"/>
-              <w:right w:w="60" w:type="dxa"/>
-            </w:tcMar>
-          </w:tcPr>
-          <w:p>
-            <w:pPr>
-              <w:spacing w:before="0" w:after="0" w:line="276" w:lineRule="auto"/>
-            </w:pPr>
-            <w:r>
-              <w:rPr>
-                <w:rFonts w:ascii="Calibri" w:hAnsi="Calibri"/>
-                <w:b/>
-                <w:color w:val="1A202C"/>
-                <w:sz w:val="16"/>
-              </w:rPr>
-              <w:t>Módulo 6: Sustentación Plenaria y Acuerdos de Vinculación</w:t>
-            </w:r>
-          </w:p>
-        </w:tc>
-        <w:tc>
-          <w:tcPr>
-            <w:tcW w:type="dxa" w:w="2340"/>
-            <w:tcMar>
-              <w:top w:w="50" w:type="dxa"/>
-              <w:left w:w="60" w:type="dxa"/>
-              <w:bottom w:w="50" w:type="dxa"/>
-              <w:right w:w="60" w:type="dxa"/>
-            </w:tcMar>
-          </w:tcPr>
-          <w:p>
-            <w:pPr>
-              <w:spacing w:before="0" w:after="0" w:line="276" w:lineRule="auto"/>
-            </w:pPr>
-            <w:r>
-              <w:rPr>
-                <w:rFonts w:ascii="Calibri" w:hAnsi="Calibri"/>
-                <w:b/>
-                <w:color w:val="1A202C"/>
-                <w:sz w:val="16"/>
-              </w:rPr>
-              <w:t>20 Puntos</w:t>
-            </w:r>
-          </w:p>
-        </w:tc>
-        <w:tc>
-          <w:tcPr>
-            <w:tcW w:type="dxa" w:w="2340"/>
-            <w:tcMar>
-              <w:top w:w="50" w:type="dxa"/>
-              <w:left w:w="60" w:type="dxa"/>
-              <w:bottom w:w="50" w:type="dxa"/>
-              <w:right w:w="60" w:type="dxa"/>
-            </w:tcMar>
-          </w:tcPr>
-          <w:p>
-            <w:pPr>
-              <w:spacing w:before="0" w:after="0" w:line="276" w:lineRule="auto"/>
-            </w:pPr>
-            <w:r>
-              <w:rPr>
-                <w:rFonts w:ascii="Calibri" w:hAnsi="Calibri"/>
-                <w:color w:val="1A202C"/>
-                <w:sz w:val="16"/>
-              </w:rPr>
-              <w:t>Sustenta con solvencia el plan de acción en la mesa plenaria, aporta retroalimentación crítica a Kinal y formaliza acuerdos de vinculación.</w:t>
-            </w:r>
-          </w:p>
-        </w:tc>
-        <w:tc>
-          <w:tcPr>
-            <w:tcW w:type="dxa" w:w="2340"/>
-            <w:tcMar>
-              <w:top w:w="50" w:type="dxa"/>
-              <w:left w:w="60" w:type="dxa"/>
-              <w:bottom w:w="50" w:type="dxa"/>
-              <w:right w:w="60" w:type="dxa"/>
-            </w:tcMar>
-          </w:tcPr>
-          <w:p>
-            <w:pPr>
-              <w:spacing w:before="0" w:after="0" w:line="276" w:lineRule="auto"/>
-            </w:pPr>
-            <w:r>
-              <w:rPr>
-                <w:rFonts w:ascii="Calibri" w:hAnsi="Calibri"/>
-                <w:color w:val="1A202C"/>
-                <w:sz w:val="16"/>
-              </w:rPr>
-              <w:t>Participación pasiva en la plenaria sin aportes significativos a la vinculación escuela-empresa (&lt; 15.0 pts).</w:t>
+              <w:t>Participación pasiva en la plenaria sin aportes significativos a la vinculación escuela-empresa (&lt; 18.7 pts).</w:t>
             </w:r>
           </w:p>
         </w:tc>
@@ -4149,7 +2927,7 @@
           <w:color w:val="003366"/>
           <w:sz w:val="22"/>
         </w:rPr>
-        <w:t>3.2 Formato de Levantamiento: Matriz Diagnóstica de Necesidades Industriales</w:t>
+        <w:t>3.2 Formato de Levantamiento: Ficha Diagnóstica de Necesidades de la Industria</w:t>
       </w:r>
     </w:p>
     <w:tbl>
@@ -4511,7 +3289,7 @@
         <w:color w:val="4A5568"/>
         <w:sz w:val="17"/>
       </w:rPr>
-      <w:t>Fundación Kinal | Programa Ejecutivo de Vinculación y Liderazgo — Dosificación Oficial</w:t>
+      <w:t>Fundación Kinal | Programa Ejecutivo de Vinculación y Liderazgo — Dosificación Oficial (8 Horas)</w:t>
     </w:r>
   </w:p>
 </w:ftr>

</xml_diff>